<commit_message>
fix space in standard
</commit_message>
<xml_diff>
--- a/docs/Doc.docx
+++ b/docs/Doc.docx
@@ -74,7 +74,6 @@
           <w:szCs w:val="18"/>
         </w:rPr>
       </w:pPr>
-      <w:proofErr w:type="spellStart"/>
       <w:r>
         <w:rPr>
           <w:rFonts w:ascii="Courier New" w:eastAsia="MS Mincho" w:hAnsi="Courier New" w:cs="Courier New"/>
@@ -85,7 +84,6 @@
         </w:rPr>
         <w:t>SmartParkingGarageSystem</w:t>
       </w:r>
-      <w:proofErr w:type="spellEnd"/>
       <w:r>
         <w:rPr>
           <w:rFonts w:ascii="Courier New" w:eastAsia="MS Mincho" w:hAnsi="Courier New" w:cs="Courier New"/>
@@ -505,21 +503,8 @@
         <w:pStyle w:val="NoSpacing"/>
       </w:pPr>
       <w:r>
-        <w:t xml:space="preserve">pip install flask </w:t>
-      </w:r>
-      <w:proofErr w:type="spellStart"/>
-      <w:r>
-        <w:t>pymongo</w:t>
-      </w:r>
-      <w:proofErr w:type="spellEnd"/>
-      <w:r>
-        <w:t xml:space="preserve"> python-</w:t>
-      </w:r>
-      <w:proofErr w:type="spellStart"/>
-      <w:r>
-        <w:t>dotenv</w:t>
-      </w:r>
-      <w:proofErr w:type="spellEnd"/>
+        <w:t>pip install flask pymongo python-dotenv</w:t>
+      </w:r>
     </w:p>
     <w:p>
       <w:pPr>
@@ -911,23 +896,7 @@
         <w:pStyle w:val="NoSpacing"/>
       </w:pPr>
       <w:r>
-        <w:t>Pass the version as a query parameter (e.g., /</w:t>
-      </w:r>
-      <w:proofErr w:type="spellStart"/>
-      <w:r>
-        <w:t>api</w:t>
-      </w:r>
-      <w:proofErr w:type="spellEnd"/>
-      <w:r>
-        <w:t>/</w:t>
-      </w:r>
-      <w:proofErr w:type="spellStart"/>
-      <w:r>
-        <w:t>spots?version</w:t>
-      </w:r>
-      <w:proofErr w:type="spellEnd"/>
-      <w:r>
-        <w:t>=1).</w:t>
+        <w:t>Pass the version as a query parameter (e.g., /api/spots?version=1).</w:t>
       </w:r>
       <w:r>
         <w:br/>
@@ -987,25 +956,7 @@
           <w:sz w:val="18"/>
           <w:szCs w:val="18"/>
         </w:rPr>
-        <w:t xml:space="preserve">def </w:t>
-      </w:r>
-      <w:proofErr w:type="spellStart"/>
-      <w:r>
-        <w:rPr>
-          <w:rFonts w:ascii="Roboto Mono" w:hAnsi="Roboto Mono"/>
-          <w:sz w:val="18"/>
-          <w:szCs w:val="18"/>
-        </w:rPr>
-        <w:t>get_spots</w:t>
-      </w:r>
-      <w:proofErr w:type="spellEnd"/>
-      <w:r>
-        <w:rPr>
-          <w:rFonts w:ascii="Roboto Mono" w:hAnsi="Roboto Mono"/>
-          <w:sz w:val="18"/>
-          <w:szCs w:val="18"/>
-        </w:rPr>
-        <w:t>():</w:t>
+        <w:t>def get_spots():</w:t>
       </w:r>
     </w:p>
     <w:p>
@@ -1047,25 +998,32 @@
           <w:sz w:val="18"/>
           <w:szCs w:val="18"/>
         </w:rPr>
-        <w:t xml:space="preserve"> = </w:t>
-      </w:r>
-      <w:proofErr w:type="spellStart"/>
-      <w:r>
+        <w:t xml:space="preserve"> = request.args.get('version', '1')</w:t>
+      </w:r>
+    </w:p>
+    <w:p>
+      <w:pPr>
+        <w:pStyle w:val="NoSpacing"/>
+        <w:pBdr>
+          <w:top w:val="single" w:sz="4" w:space="1" w:color="auto"/>
+          <w:left w:val="single" w:sz="4" w:space="4" w:color="auto"/>
+          <w:bottom w:val="single" w:sz="4" w:space="1" w:color="auto"/>
+          <w:right w:val="single" w:sz="4" w:space="4" w:color="auto"/>
+        </w:pBdr>
+        <w:shd w:val="clear" w:color="auto" w:fill="FFF2CC" w:themeFill="accent4" w:themeFillTint="33"/>
         <w:rPr>
           <w:rFonts w:ascii="Roboto Mono" w:hAnsi="Roboto Mono"/>
           <w:sz w:val="18"/>
           <w:szCs w:val="18"/>
         </w:rPr>
-        <w:t>request.args.get</w:t>
-      </w:r>
-      <w:proofErr w:type="spellEnd"/>
+      </w:pPr>
       <w:r>
         <w:rPr>
           <w:rFonts w:ascii="Roboto Mono" w:hAnsi="Roboto Mono"/>
           <w:sz w:val="18"/>
           <w:szCs w:val="18"/>
         </w:rPr>
-        <w:t>('version', '1')</w:t>
+        <w:t xml:space="preserve">    if version == '1':</w:t>
       </w:r>
     </w:p>
     <w:p>
@@ -1090,7 +1048,7 @@
           <w:sz w:val="18"/>
           <w:szCs w:val="18"/>
         </w:rPr>
-        <w:t xml:space="preserve">    if version == '1':</w:t>
+        <w:t xml:space="preserve">        # V1 logic</w:t>
       </w:r>
     </w:p>
     <w:p>
@@ -1115,50 +1073,7 @@
           <w:sz w:val="18"/>
           <w:szCs w:val="18"/>
         </w:rPr>
-        <w:t xml:space="preserve">        # V1 logic</w:t>
-      </w:r>
-    </w:p>
-    <w:p>
-      <w:pPr>
-        <w:pStyle w:val="NoSpacing"/>
-        <w:pBdr>
-          <w:top w:val="single" w:sz="4" w:space="1" w:color="auto"/>
-          <w:left w:val="single" w:sz="4" w:space="4" w:color="auto"/>
-          <w:bottom w:val="single" w:sz="4" w:space="1" w:color="auto"/>
-          <w:right w:val="single" w:sz="4" w:space="4" w:color="auto"/>
-        </w:pBdr>
-        <w:shd w:val="clear" w:color="auto" w:fill="FFF2CC" w:themeFill="accent4" w:themeFillTint="33"/>
-        <w:rPr>
-          <w:rFonts w:ascii="Roboto Mono" w:hAnsi="Roboto Mono"/>
-          <w:sz w:val="18"/>
-          <w:szCs w:val="18"/>
-        </w:rPr>
-      </w:pPr>
-      <w:r>
-        <w:rPr>
-          <w:rFonts w:ascii="Roboto Mono" w:hAnsi="Roboto Mono"/>
-          <w:sz w:val="18"/>
-          <w:szCs w:val="18"/>
-        </w:rPr>
-        <w:t xml:space="preserve">    </w:t>
-      </w:r>
-      <w:proofErr w:type="spellStart"/>
-      <w:r>
-        <w:rPr>
-          <w:rFonts w:ascii="Roboto Mono" w:hAnsi="Roboto Mono"/>
-          <w:sz w:val="18"/>
-          <w:szCs w:val="18"/>
-        </w:rPr>
-        <w:t>elif</w:t>
-      </w:r>
-      <w:proofErr w:type="spellEnd"/>
-      <w:r>
-        <w:rPr>
-          <w:rFonts w:ascii="Roboto Mono" w:hAnsi="Roboto Mono"/>
-          <w:sz w:val="18"/>
-          <w:szCs w:val="18"/>
-        </w:rPr>
-        <w:t xml:space="preserve"> version == '2':</w:t>
+        <w:t xml:space="preserve">    elif version == '2':</w:t>
       </w:r>
     </w:p>
     <w:p>
@@ -1365,25 +1280,7 @@
           <w:sz w:val="18"/>
           <w:szCs w:val="18"/>
         </w:rPr>
-        <w:t xml:space="preserve">def </w:t>
-      </w:r>
-      <w:proofErr w:type="spellStart"/>
-      <w:r>
-        <w:rPr>
-          <w:rFonts w:ascii="Roboto Mono" w:hAnsi="Roboto Mono"/>
-          <w:sz w:val="18"/>
-          <w:szCs w:val="18"/>
-        </w:rPr>
-        <w:t>get_spots</w:t>
-      </w:r>
-      <w:proofErr w:type="spellEnd"/>
-      <w:r>
-        <w:rPr>
-          <w:rFonts w:ascii="Roboto Mono" w:hAnsi="Roboto Mono"/>
-          <w:sz w:val="18"/>
-          <w:szCs w:val="18"/>
-        </w:rPr>
-        <w:t>():</w:t>
+        <w:t>def get_spots():</w:t>
       </w:r>
     </w:p>
     <w:p>
@@ -1425,25 +1322,32 @@
           <w:sz w:val="18"/>
           <w:szCs w:val="18"/>
         </w:rPr>
-        <w:t xml:space="preserve"> = </w:t>
-      </w:r>
-      <w:proofErr w:type="spellStart"/>
-      <w:r>
+        <w:t xml:space="preserve"> = request.headers.get('Accept-Version', 'v1')</w:t>
+      </w:r>
+    </w:p>
+    <w:p>
+      <w:pPr>
+        <w:pStyle w:val="NoSpacing"/>
+        <w:pBdr>
+          <w:top w:val="single" w:sz="4" w:space="1" w:color="auto"/>
+          <w:left w:val="single" w:sz="4" w:space="4" w:color="auto"/>
+          <w:bottom w:val="single" w:sz="4" w:space="1" w:color="auto"/>
+          <w:right w:val="single" w:sz="4" w:space="4" w:color="auto"/>
+        </w:pBdr>
+        <w:shd w:val="clear" w:color="auto" w:fill="FFF2CC" w:themeFill="accent4" w:themeFillTint="33"/>
         <w:rPr>
           <w:rFonts w:ascii="Roboto Mono" w:hAnsi="Roboto Mono"/>
           <w:sz w:val="18"/>
           <w:szCs w:val="18"/>
         </w:rPr>
-        <w:t>request.headers.get</w:t>
-      </w:r>
-      <w:proofErr w:type="spellEnd"/>
+      </w:pPr>
       <w:r>
         <w:rPr>
           <w:rFonts w:ascii="Roboto Mono" w:hAnsi="Roboto Mono"/>
           <w:sz w:val="18"/>
           <w:szCs w:val="18"/>
         </w:rPr>
-        <w:t>('Accept-Version', 'v1')</w:t>
+        <w:t xml:space="preserve">    if version == 'v1':</w:t>
       </w:r>
     </w:p>
     <w:p>
@@ -1468,7 +1372,7 @@
           <w:sz w:val="18"/>
           <w:szCs w:val="18"/>
         </w:rPr>
-        <w:t xml:space="preserve">    if version == 'v1':</w:t>
+        <w:t xml:space="preserve">        # V1 logic</w:t>
       </w:r>
     </w:p>
     <w:p>
@@ -1493,50 +1397,7 @@
           <w:sz w:val="18"/>
           <w:szCs w:val="18"/>
         </w:rPr>
-        <w:t xml:space="preserve">        # V1 logic</w:t>
-      </w:r>
-    </w:p>
-    <w:p>
-      <w:pPr>
-        <w:pStyle w:val="NoSpacing"/>
-        <w:pBdr>
-          <w:top w:val="single" w:sz="4" w:space="1" w:color="auto"/>
-          <w:left w:val="single" w:sz="4" w:space="4" w:color="auto"/>
-          <w:bottom w:val="single" w:sz="4" w:space="1" w:color="auto"/>
-          <w:right w:val="single" w:sz="4" w:space="4" w:color="auto"/>
-        </w:pBdr>
-        <w:shd w:val="clear" w:color="auto" w:fill="FFF2CC" w:themeFill="accent4" w:themeFillTint="33"/>
-        <w:rPr>
-          <w:rFonts w:ascii="Roboto Mono" w:hAnsi="Roboto Mono"/>
-          <w:sz w:val="18"/>
-          <w:szCs w:val="18"/>
-        </w:rPr>
-      </w:pPr>
-      <w:r>
-        <w:rPr>
-          <w:rFonts w:ascii="Roboto Mono" w:hAnsi="Roboto Mono"/>
-          <w:sz w:val="18"/>
-          <w:szCs w:val="18"/>
-        </w:rPr>
-        <w:t xml:space="preserve">    </w:t>
-      </w:r>
-      <w:proofErr w:type="spellStart"/>
-      <w:r>
-        <w:rPr>
-          <w:rFonts w:ascii="Roboto Mono" w:hAnsi="Roboto Mono"/>
-          <w:sz w:val="18"/>
-          <w:szCs w:val="18"/>
-        </w:rPr>
-        <w:t>elif</w:t>
-      </w:r>
-      <w:proofErr w:type="spellEnd"/>
-      <w:r>
-        <w:rPr>
-          <w:rFonts w:ascii="Roboto Mono" w:hAnsi="Roboto Mono"/>
-          <w:sz w:val="18"/>
-          <w:szCs w:val="18"/>
-        </w:rPr>
-        <w:t xml:space="preserve"> version == 'v2':</w:t>
+        <w:t xml:space="preserve">    elif version == 'v2':</w:t>
       </w:r>
     </w:p>
     <w:p>
@@ -1717,52 +1578,33 @@
           <w:sz w:val="18"/>
           <w:szCs w:val="18"/>
         </w:rPr>
-        <w:t xml:space="preserve">def </w:t>
-      </w:r>
-      <w:proofErr w:type="spellStart"/>
-      <w:r>
+        <w:t>def get_spots():</w:t>
+      </w:r>
+    </w:p>
+    <w:p>
+      <w:pPr>
+        <w:pStyle w:val="NoSpacing"/>
+        <w:pBdr>
+          <w:top w:val="single" w:sz="4" w:space="1" w:color="auto"/>
+          <w:left w:val="single" w:sz="4" w:space="4" w:color="auto"/>
+          <w:bottom w:val="single" w:sz="4" w:space="1" w:color="auto"/>
+          <w:right w:val="single" w:sz="4" w:space="4" w:color="auto"/>
+        </w:pBdr>
+        <w:shd w:val="clear" w:color="auto" w:fill="FFF2CC" w:themeFill="accent4" w:themeFillTint="33"/>
         <w:rPr>
           <w:rFonts w:ascii="Roboto Mono" w:hAnsi="Roboto Mono"/>
           <w:sz w:val="18"/>
           <w:szCs w:val="18"/>
         </w:rPr>
-        <w:t>get_spots</w:t>
-      </w:r>
-      <w:proofErr w:type="spellEnd"/>
+      </w:pPr>
       <w:r>
         <w:rPr>
           <w:rFonts w:ascii="Roboto Mono" w:hAnsi="Roboto Mono"/>
           <w:sz w:val="18"/>
           <w:szCs w:val="18"/>
         </w:rPr>
-        <w:t>():</w:t>
-      </w:r>
-    </w:p>
-    <w:p>
-      <w:pPr>
-        <w:pStyle w:val="NoSpacing"/>
-        <w:pBdr>
-          <w:top w:val="single" w:sz="4" w:space="1" w:color="auto"/>
-          <w:left w:val="single" w:sz="4" w:space="4" w:color="auto"/>
-          <w:bottom w:val="single" w:sz="4" w:space="1" w:color="auto"/>
-          <w:right w:val="single" w:sz="4" w:space="4" w:color="auto"/>
-        </w:pBdr>
-        <w:shd w:val="clear" w:color="auto" w:fill="FFF2CC" w:themeFill="accent4" w:themeFillTint="33"/>
-        <w:rPr>
-          <w:rFonts w:ascii="Roboto Mono" w:hAnsi="Roboto Mono"/>
-          <w:sz w:val="18"/>
-          <w:szCs w:val="18"/>
-        </w:rPr>
-      </w:pPr>
-      <w:r>
-        <w:rPr>
-          <w:rFonts w:ascii="Roboto Mono" w:hAnsi="Roboto Mono"/>
-          <w:sz w:val="18"/>
-          <w:szCs w:val="18"/>
-        </w:rPr>
         <w:t xml:space="preserve">    </w:t>
       </w:r>
-      <w:proofErr w:type="spellStart"/>
       <w:r>
         <w:rPr>
           <w:rFonts w:ascii="Roboto Mono" w:hAnsi="Roboto Mono"/>
@@ -1772,32 +1614,38 @@
         </w:rPr>
         <w:t>accept_header</w:t>
       </w:r>
-      <w:proofErr w:type="spellEnd"/>
       <w:r>
         <w:rPr>
           <w:rFonts w:ascii="Roboto Mono" w:hAnsi="Roboto Mono"/>
           <w:sz w:val="18"/>
           <w:szCs w:val="18"/>
         </w:rPr>
-        <w:t xml:space="preserve"> = </w:t>
-      </w:r>
-      <w:proofErr w:type="spellStart"/>
-      <w:r>
+        <w:t xml:space="preserve"> = request.headers.get('Accept', '')</w:t>
+      </w:r>
+    </w:p>
+    <w:p>
+      <w:pPr>
+        <w:pStyle w:val="NoSpacing"/>
+        <w:pBdr>
+          <w:top w:val="single" w:sz="4" w:space="1" w:color="auto"/>
+          <w:left w:val="single" w:sz="4" w:space="4" w:color="auto"/>
+          <w:bottom w:val="single" w:sz="4" w:space="1" w:color="auto"/>
+          <w:right w:val="single" w:sz="4" w:space="4" w:color="auto"/>
+        </w:pBdr>
+        <w:shd w:val="clear" w:color="auto" w:fill="FFF2CC" w:themeFill="accent4" w:themeFillTint="33"/>
         <w:rPr>
           <w:rFonts w:ascii="Roboto Mono" w:hAnsi="Roboto Mono"/>
           <w:sz w:val="18"/>
           <w:szCs w:val="18"/>
         </w:rPr>
-        <w:t>request.headers.get</w:t>
-      </w:r>
-      <w:proofErr w:type="spellEnd"/>
+      </w:pPr>
       <w:r>
         <w:rPr>
           <w:rFonts w:ascii="Roboto Mono" w:hAnsi="Roboto Mono"/>
           <w:sz w:val="18"/>
           <w:szCs w:val="18"/>
         </w:rPr>
-        <w:t>('Accept', '')</w:t>
+        <w:t xml:space="preserve">    if 'vnd.myapi.v1' in accept_header:</w:t>
       </w:r>
     </w:p>
     <w:p>
@@ -1822,111 +1670,32 @@
           <w:sz w:val="18"/>
           <w:szCs w:val="18"/>
         </w:rPr>
-        <w:t xml:space="preserve">    if 'vnd.myapi.v1' in </w:t>
-      </w:r>
-      <w:proofErr w:type="spellStart"/>
-      <w:r>
+        <w:t xml:space="preserve">        # V1 logic</w:t>
+      </w:r>
+    </w:p>
+    <w:p>
+      <w:pPr>
+        <w:pStyle w:val="NoSpacing"/>
+        <w:pBdr>
+          <w:top w:val="single" w:sz="4" w:space="1" w:color="auto"/>
+          <w:left w:val="single" w:sz="4" w:space="4" w:color="auto"/>
+          <w:bottom w:val="single" w:sz="4" w:space="1" w:color="auto"/>
+          <w:right w:val="single" w:sz="4" w:space="4" w:color="auto"/>
+        </w:pBdr>
+        <w:shd w:val="clear" w:color="auto" w:fill="FFF2CC" w:themeFill="accent4" w:themeFillTint="33"/>
         <w:rPr>
           <w:rFonts w:ascii="Roboto Mono" w:hAnsi="Roboto Mono"/>
           <w:sz w:val="18"/>
           <w:szCs w:val="18"/>
         </w:rPr>
-        <w:t>accept_header</w:t>
-      </w:r>
-      <w:proofErr w:type="spellEnd"/>
+      </w:pPr>
       <w:r>
         <w:rPr>
           <w:rFonts w:ascii="Roboto Mono" w:hAnsi="Roboto Mono"/>
           <w:sz w:val="18"/>
           <w:szCs w:val="18"/>
         </w:rPr>
-        <w:t>:</w:t>
-      </w:r>
-    </w:p>
-    <w:p>
-      <w:pPr>
-        <w:pStyle w:val="NoSpacing"/>
-        <w:pBdr>
-          <w:top w:val="single" w:sz="4" w:space="1" w:color="auto"/>
-          <w:left w:val="single" w:sz="4" w:space="4" w:color="auto"/>
-          <w:bottom w:val="single" w:sz="4" w:space="1" w:color="auto"/>
-          <w:right w:val="single" w:sz="4" w:space="4" w:color="auto"/>
-        </w:pBdr>
-        <w:shd w:val="clear" w:color="auto" w:fill="FFF2CC" w:themeFill="accent4" w:themeFillTint="33"/>
-        <w:rPr>
-          <w:rFonts w:ascii="Roboto Mono" w:hAnsi="Roboto Mono"/>
-          <w:sz w:val="18"/>
-          <w:szCs w:val="18"/>
-        </w:rPr>
-      </w:pPr>
-      <w:r>
-        <w:rPr>
-          <w:rFonts w:ascii="Roboto Mono" w:hAnsi="Roboto Mono"/>
-          <w:sz w:val="18"/>
-          <w:szCs w:val="18"/>
-        </w:rPr>
-        <w:t xml:space="preserve">        # V1 logic</w:t>
-      </w:r>
-    </w:p>
-    <w:p>
-      <w:pPr>
-        <w:pStyle w:val="NoSpacing"/>
-        <w:pBdr>
-          <w:top w:val="single" w:sz="4" w:space="1" w:color="auto"/>
-          <w:left w:val="single" w:sz="4" w:space="4" w:color="auto"/>
-          <w:bottom w:val="single" w:sz="4" w:space="1" w:color="auto"/>
-          <w:right w:val="single" w:sz="4" w:space="4" w:color="auto"/>
-        </w:pBdr>
-        <w:shd w:val="clear" w:color="auto" w:fill="FFF2CC" w:themeFill="accent4" w:themeFillTint="33"/>
-        <w:rPr>
-          <w:rFonts w:ascii="Roboto Mono" w:hAnsi="Roboto Mono"/>
-          <w:sz w:val="18"/>
-          <w:szCs w:val="18"/>
-        </w:rPr>
-      </w:pPr>
-      <w:r>
-        <w:rPr>
-          <w:rFonts w:ascii="Roboto Mono" w:hAnsi="Roboto Mono"/>
-          <w:sz w:val="18"/>
-          <w:szCs w:val="18"/>
-        </w:rPr>
-        <w:t xml:space="preserve">    </w:t>
-      </w:r>
-      <w:proofErr w:type="spellStart"/>
-      <w:r>
-        <w:rPr>
-          <w:rFonts w:ascii="Roboto Mono" w:hAnsi="Roboto Mono"/>
-          <w:sz w:val="18"/>
-          <w:szCs w:val="18"/>
-        </w:rPr>
-        <w:t>elif</w:t>
-      </w:r>
-      <w:proofErr w:type="spellEnd"/>
-      <w:r>
-        <w:rPr>
-          <w:rFonts w:ascii="Roboto Mono" w:hAnsi="Roboto Mono"/>
-          <w:sz w:val="18"/>
-          <w:szCs w:val="18"/>
-        </w:rPr>
-        <w:t xml:space="preserve"> 'vnd.myapi.v2' in </w:t>
-      </w:r>
-      <w:proofErr w:type="spellStart"/>
-      <w:r>
-        <w:rPr>
-          <w:rFonts w:ascii="Roboto Mono" w:hAnsi="Roboto Mono"/>
-          <w:sz w:val="18"/>
-          <w:szCs w:val="18"/>
-        </w:rPr>
-        <w:t>accept_header</w:t>
-      </w:r>
-      <w:proofErr w:type="spellEnd"/>
-      <w:r>
-        <w:rPr>
-          <w:rFonts w:ascii="Roboto Mono" w:hAnsi="Roboto Mono"/>
-          <w:sz w:val="18"/>
-          <w:szCs w:val="18"/>
-        </w:rPr>
-        <w:t>:</w:t>
+        <w:t xml:space="preserve">    elif 'vnd.myapi.v2' in accept_header:</w:t>
       </w:r>
     </w:p>
     <w:p>
@@ -2528,23 +2297,7 @@
           <w:b/>
           <w:bCs/>
         </w:rPr>
-        <w:t>1. /v1/</w:t>
-      </w:r>
-      <w:proofErr w:type="spellStart"/>
-      <w:r>
-        <w:rPr>
-          <w:b/>
-          <w:bCs/>
-        </w:rPr>
-        <w:t>api</w:t>
-      </w:r>
-      <w:proofErr w:type="spellEnd"/>
-      <w:r>
-        <w:rPr>
-          <w:b/>
-          <w:bCs/>
-        </w:rPr>
-        <w:t>/spots (GET)</w:t>
+        <w:t>1. /v1/api/spots (GET)</w:t>
       </w:r>
     </w:p>
     <w:p>
@@ -2579,15 +2332,7 @@
         <w:t>Test:</w:t>
       </w:r>
       <w:r>
-        <w:t> GET /v1/</w:t>
-      </w:r>
-      <w:proofErr w:type="spellStart"/>
-      <w:r>
-        <w:t>api</w:t>
-      </w:r>
-      <w:proofErr w:type="spellEnd"/>
-      <w:r>
-        <w:t>/spots</w:t>
+        <w:t> GET /v1/api/spots</w:t>
       </w:r>
     </w:p>
     <w:p>
@@ -2606,47 +2351,23 @@
         <w:t>Expected:</w:t>
       </w:r>
       <w:r>
-        <w:t> Returns JSON array, each item with floor, bay, </w:t>
-      </w:r>
-      <w:proofErr w:type="spellStart"/>
-      <w:r>
-        <w:t>spot_id</w:t>
-      </w:r>
-      <w:proofErr w:type="spellEnd"/>
-      <w:r>
-        <w:t>, type, status (and car info for occupied spots).</w:t>
-      </w:r>
-    </w:p>
-    <w:p>
-      <w:pPr>
-        <w:pStyle w:val="NoSpacing"/>
-        <w:rPr>
-          <w:b/>
-          <w:bCs/>
-        </w:rPr>
-      </w:pPr>
-      <w:r>
-        <w:rPr>
-          <w:b/>
-          <w:bCs/>
-        </w:rPr>
-        <w:t>2. /v1/</w:t>
-      </w:r>
-      <w:proofErr w:type="spellStart"/>
-      <w:r>
-        <w:rPr>
-          <w:b/>
-          <w:bCs/>
-        </w:rPr>
-        <w:t>api</w:t>
-      </w:r>
-      <w:proofErr w:type="spellEnd"/>
-      <w:r>
-        <w:rPr>
-          <w:b/>
-          <w:bCs/>
-        </w:rPr>
-        <w:t>/spots/available (GET)</w:t>
+        <w:t> Returns JSON array, each item with floor, bay, spot_id, type, status (and car info for occupied spots).</w:t>
+      </w:r>
+    </w:p>
+    <w:p>
+      <w:pPr>
+        <w:pStyle w:val="NoSpacing"/>
+        <w:rPr>
+          <w:b/>
+          <w:bCs/>
+        </w:rPr>
+      </w:pPr>
+      <w:r>
+        <w:rPr>
+          <w:b/>
+          <w:bCs/>
+        </w:rPr>
+        <w:t>2. /v1/api/spots/available (GET)</w:t>
       </w:r>
     </w:p>
     <w:p>
@@ -2681,23 +2402,7 @@
         <w:t>Test:</w:t>
       </w:r>
       <w:r>
-        <w:t> GET /v1/</w:t>
-      </w:r>
-      <w:proofErr w:type="spellStart"/>
-      <w:r>
-        <w:t>api</w:t>
-      </w:r>
-      <w:proofErr w:type="spellEnd"/>
-      <w:r>
-        <w:t>/spots/</w:t>
-      </w:r>
-      <w:proofErr w:type="spellStart"/>
-      <w:r>
-        <w:t>available?type</w:t>
-      </w:r>
-      <w:proofErr w:type="spellEnd"/>
-      <w:r>
-        <w:t>=standard</w:t>
+        <w:t> GET /v1/api/spots/available?type=standard</w:t>
       </w:r>
     </w:p>
     <w:p>
@@ -2732,23 +2437,7 @@
           <w:b/>
           <w:bCs/>
         </w:rPr>
-        <w:t>3. /v1/</w:t>
-      </w:r>
-      <w:proofErr w:type="spellStart"/>
-      <w:r>
-        <w:rPr>
-          <w:b/>
-          <w:bCs/>
-        </w:rPr>
-        <w:t>api</w:t>
-      </w:r>
-      <w:proofErr w:type="spellEnd"/>
-      <w:r>
-        <w:rPr>
-          <w:b/>
-          <w:bCs/>
-        </w:rPr>
-        <w:t>/cars/park (POST)</w:t>
+        <w:t>3. /v1/api/cars/park (POST)</w:t>
       </w:r>
     </w:p>
     <w:p>
@@ -2805,86 +2494,32 @@
           <w:sz w:val="18"/>
           <w:szCs w:val="18"/>
         </w:rPr>
-        <w:t>POST /v1/</w:t>
-      </w:r>
-      <w:proofErr w:type="spellStart"/>
-      <w:r>
+        <w:t>POST /v1/api/cars/park</w:t>
+      </w:r>
+    </w:p>
+    <w:p>
+      <w:pPr>
+        <w:pStyle w:val="NoSpacing"/>
+        <w:pBdr>
+          <w:top w:val="single" w:sz="4" w:space="1" w:color="auto"/>
+          <w:left w:val="single" w:sz="4" w:space="4" w:color="auto"/>
+          <w:bottom w:val="single" w:sz="4" w:space="1" w:color="auto"/>
+          <w:right w:val="single" w:sz="4" w:space="4" w:color="auto"/>
+        </w:pBdr>
+        <w:shd w:val="clear" w:color="auto" w:fill="FFF2CC" w:themeFill="accent4" w:themeFillTint="33"/>
         <w:rPr>
           <w:rFonts w:ascii="Roboto Mono" w:hAnsi="Roboto Mono"/>
           <w:sz w:val="18"/>
           <w:szCs w:val="18"/>
         </w:rPr>
-        <w:t>api</w:t>
-      </w:r>
-      <w:proofErr w:type="spellEnd"/>
+      </w:pPr>
       <w:r>
         <w:rPr>
           <w:rFonts w:ascii="Roboto Mono" w:hAnsi="Roboto Mono"/>
           <w:sz w:val="18"/>
           <w:szCs w:val="18"/>
         </w:rPr>
-        <w:t>/cars/park</w:t>
-      </w:r>
-    </w:p>
-    <w:p>
-      <w:pPr>
-        <w:pStyle w:val="NoSpacing"/>
-        <w:pBdr>
-          <w:top w:val="single" w:sz="4" w:space="1" w:color="auto"/>
-          <w:left w:val="single" w:sz="4" w:space="4" w:color="auto"/>
-          <w:bottom w:val="single" w:sz="4" w:space="1" w:color="auto"/>
-          <w:right w:val="single" w:sz="4" w:space="4" w:color="auto"/>
-        </w:pBdr>
-        <w:shd w:val="clear" w:color="auto" w:fill="FFF2CC" w:themeFill="accent4" w:themeFillTint="33"/>
-        <w:rPr>
-          <w:rFonts w:ascii="Roboto Mono" w:hAnsi="Roboto Mono"/>
-          <w:sz w:val="18"/>
-          <w:szCs w:val="18"/>
-        </w:rPr>
-      </w:pPr>
-      <w:r>
-        <w:rPr>
-          <w:rFonts w:ascii="Roboto Mono" w:hAnsi="Roboto Mono"/>
-          <w:sz w:val="18"/>
-          <w:szCs w:val="18"/>
-        </w:rPr>
-        <w:t>Body: { "</w:t>
-      </w:r>
-      <w:proofErr w:type="spellStart"/>
-      <w:r>
-        <w:rPr>
-          <w:rFonts w:ascii="Roboto Mono" w:hAnsi="Roboto Mono"/>
-          <w:sz w:val="18"/>
-          <w:szCs w:val="18"/>
-        </w:rPr>
-        <w:t>license_plate</w:t>
-      </w:r>
-      <w:proofErr w:type="spellEnd"/>
-      <w:r>
-        <w:rPr>
-          <w:rFonts w:ascii="Roboto Mono" w:hAnsi="Roboto Mono"/>
-          <w:sz w:val="18"/>
-          <w:szCs w:val="18"/>
-        </w:rPr>
-        <w:t>": "XYZ123", "</w:t>
-      </w:r>
-      <w:proofErr w:type="spellStart"/>
-      <w:r>
-        <w:rPr>
-          <w:rFonts w:ascii="Roboto Mono" w:hAnsi="Roboto Mono"/>
-          <w:sz w:val="18"/>
-          <w:szCs w:val="18"/>
-        </w:rPr>
-        <w:t>car_size</w:t>
-      </w:r>
-      <w:proofErr w:type="spellEnd"/>
-      <w:r>
-        <w:rPr>
-          <w:rFonts w:ascii="Roboto Mono" w:hAnsi="Roboto Mono"/>
-          <w:sz w:val="18"/>
-          <w:szCs w:val="18"/>
-        </w:rPr>
-        <w:t>": "medium" }</w:t>
+        <w:t>Body: { "license_plate": "XYZ123", "car_size": "medium" }</w:t>
       </w:r>
     </w:p>
     <w:p>
@@ -2903,47 +2538,23 @@
         <w:t>Expected:</w:t>
       </w:r>
       <w:r>
-        <w:t> JSON response with assigned spot info (e.g. </w:t>
-      </w:r>
-      <w:proofErr w:type="spellStart"/>
-      <w:r>
-        <w:t>spot_id</w:t>
-      </w:r>
-      <w:proofErr w:type="spellEnd"/>
-      <w:r>
-        <w:t>, floor, bay).</w:t>
-      </w:r>
-    </w:p>
-    <w:p>
-      <w:pPr>
-        <w:pStyle w:val="NoSpacing"/>
-        <w:rPr>
-          <w:b/>
-          <w:bCs/>
-        </w:rPr>
-      </w:pPr>
-      <w:r>
-        <w:rPr>
-          <w:b/>
-          <w:bCs/>
-        </w:rPr>
-        <w:t>4. /v1/</w:t>
-      </w:r>
-      <w:proofErr w:type="spellStart"/>
-      <w:r>
-        <w:rPr>
-          <w:b/>
-          <w:bCs/>
-        </w:rPr>
-        <w:t>api</w:t>
-      </w:r>
-      <w:proofErr w:type="spellEnd"/>
-      <w:r>
-        <w:rPr>
-          <w:b/>
-          <w:bCs/>
-        </w:rPr>
-        <w:t>/cars/exit (POST)</w:t>
+        <w:t> JSON response with assigned spot info (e.g. spot_id, floor, bay).</w:t>
+      </w:r>
+    </w:p>
+    <w:p>
+      <w:pPr>
+        <w:pStyle w:val="NoSpacing"/>
+        <w:rPr>
+          <w:b/>
+          <w:bCs/>
+        </w:rPr>
+      </w:pPr>
+      <w:r>
+        <w:rPr>
+          <w:b/>
+          <w:bCs/>
+        </w:rPr>
+        <w:t>4. /v1/api/cars/exit (POST)</w:t>
       </w:r>
     </w:p>
     <w:p>
@@ -3000,68 +2611,32 @@
           <w:sz w:val="18"/>
           <w:szCs w:val="18"/>
         </w:rPr>
-        <w:t>POST /v1/</w:t>
-      </w:r>
-      <w:proofErr w:type="spellStart"/>
-      <w:r>
+        <w:t>POST /v1/api/cars/exit</w:t>
+      </w:r>
+    </w:p>
+    <w:p>
+      <w:pPr>
+        <w:pStyle w:val="NoSpacing"/>
+        <w:pBdr>
+          <w:top w:val="single" w:sz="4" w:space="1" w:color="auto"/>
+          <w:left w:val="single" w:sz="4" w:space="4" w:color="auto"/>
+          <w:bottom w:val="single" w:sz="4" w:space="1" w:color="auto"/>
+          <w:right w:val="single" w:sz="4" w:space="4" w:color="auto"/>
+        </w:pBdr>
+        <w:shd w:val="clear" w:color="auto" w:fill="FFF2CC" w:themeFill="accent4" w:themeFillTint="33"/>
         <w:rPr>
           <w:rFonts w:ascii="Roboto Mono" w:hAnsi="Roboto Mono"/>
           <w:sz w:val="18"/>
           <w:szCs w:val="18"/>
         </w:rPr>
-        <w:t>api</w:t>
-      </w:r>
-      <w:proofErr w:type="spellEnd"/>
+      </w:pPr>
       <w:r>
         <w:rPr>
           <w:rFonts w:ascii="Roboto Mono" w:hAnsi="Roboto Mono"/>
           <w:sz w:val="18"/>
           <w:szCs w:val="18"/>
         </w:rPr>
-        <w:t>/cars/exit</w:t>
-      </w:r>
-    </w:p>
-    <w:p>
-      <w:pPr>
-        <w:pStyle w:val="NoSpacing"/>
-        <w:pBdr>
-          <w:top w:val="single" w:sz="4" w:space="1" w:color="auto"/>
-          <w:left w:val="single" w:sz="4" w:space="4" w:color="auto"/>
-          <w:bottom w:val="single" w:sz="4" w:space="1" w:color="auto"/>
-          <w:right w:val="single" w:sz="4" w:space="4" w:color="auto"/>
-        </w:pBdr>
-        <w:shd w:val="clear" w:color="auto" w:fill="FFF2CC" w:themeFill="accent4" w:themeFillTint="33"/>
-        <w:rPr>
-          <w:rFonts w:ascii="Roboto Mono" w:hAnsi="Roboto Mono"/>
-          <w:sz w:val="18"/>
-          <w:szCs w:val="18"/>
-        </w:rPr>
-      </w:pPr>
-      <w:r>
-        <w:rPr>
-          <w:rFonts w:ascii="Roboto Mono" w:hAnsi="Roboto Mono"/>
-          <w:sz w:val="18"/>
-          <w:szCs w:val="18"/>
-        </w:rPr>
-        <w:t>Body: { "</w:t>
-      </w:r>
-      <w:proofErr w:type="spellStart"/>
-      <w:r>
-        <w:rPr>
-          <w:rFonts w:ascii="Roboto Mono" w:hAnsi="Roboto Mono"/>
-          <w:sz w:val="18"/>
-          <w:szCs w:val="18"/>
-        </w:rPr>
-        <w:t>license_plate</w:t>
-      </w:r>
-      <w:proofErr w:type="spellEnd"/>
-      <w:r>
-        <w:rPr>
-          <w:rFonts w:ascii="Roboto Mono" w:hAnsi="Roboto Mono"/>
-          <w:sz w:val="18"/>
-          <w:szCs w:val="18"/>
-        </w:rPr>
-        <w:t>": "XYZ123" }</w:t>
+        <w:t>Body: { "license_plate": "XYZ123" }</w:t>
       </w:r>
     </w:p>
     <w:p>
@@ -3080,47 +2655,23 @@
         <w:t>Expected:</w:t>
       </w:r>
       <w:r>
-        <w:t> JSON with </w:t>
-      </w:r>
-      <w:proofErr w:type="spellStart"/>
-      <w:r>
-        <w:t>duration_hours</w:t>
-      </w:r>
-      <w:proofErr w:type="spellEnd"/>
-      <w:r>
-        <w:t>, fee, and calculation details (car is checked out, spot is now available).</w:t>
-      </w:r>
-    </w:p>
-    <w:p>
-      <w:pPr>
-        <w:pStyle w:val="NoSpacing"/>
-        <w:rPr>
-          <w:b/>
-          <w:bCs/>
-        </w:rPr>
-      </w:pPr>
-      <w:r>
-        <w:rPr>
-          <w:b/>
-          <w:bCs/>
-        </w:rPr>
-        <w:t>5. /v1/</w:t>
-      </w:r>
-      <w:proofErr w:type="spellStart"/>
-      <w:r>
-        <w:rPr>
-          <w:b/>
-          <w:bCs/>
-        </w:rPr>
-        <w:t>api</w:t>
-      </w:r>
-      <w:proofErr w:type="spellEnd"/>
-      <w:r>
-        <w:rPr>
-          <w:b/>
-          <w:bCs/>
-        </w:rPr>
-        <w:t>/cars/find (GET)</w:t>
+        <w:t> JSON with duration_hours, fee, and calculation details (car is checked out, spot is now available).</w:t>
+      </w:r>
+    </w:p>
+    <w:p>
+      <w:pPr>
+        <w:pStyle w:val="NoSpacing"/>
+        <w:rPr>
+          <w:b/>
+          <w:bCs/>
+        </w:rPr>
+      </w:pPr>
+      <w:r>
+        <w:rPr>
+          <w:b/>
+          <w:bCs/>
+        </w:rPr>
+        <w:t>5. /v1/api/cars/find (GET)</w:t>
       </w:r>
     </w:p>
     <w:p>
@@ -3155,23 +2706,7 @@
         <w:t>Test:</w:t>
       </w:r>
       <w:r>
-        <w:t> GET /v1/</w:t>
-      </w:r>
-      <w:proofErr w:type="spellStart"/>
-      <w:r>
-        <w:t>api</w:t>
-      </w:r>
-      <w:proofErr w:type="spellEnd"/>
-      <w:r>
-        <w:t>/cars/</w:t>
-      </w:r>
-      <w:proofErr w:type="spellStart"/>
-      <w:r>
-        <w:t>find?license_plate</w:t>
-      </w:r>
-      <w:proofErr w:type="spellEnd"/>
-      <w:r>
-        <w:t>=XYZ123</w:t>
+        <w:t> GET /v1/api/cars/find?license_plate=XYZ123</w:t>
       </w:r>
     </w:p>
     <w:p>
@@ -3260,15 +2795,7 @@
         </w:numPr>
       </w:pPr>
       <w:r>
-        <w:t>/v1/</w:t>
-      </w:r>
-      <w:proofErr w:type="spellStart"/>
-      <w:r>
-        <w:t>api</w:t>
-      </w:r>
-      <w:proofErr w:type="spellEnd"/>
-      <w:r>
-        <w:t>/cars/park — adds a car record and marks spot as occupied.</w:t>
+        <w:t>/v1/api/cars/park — adds a car record and marks spot as occupied.</w:t>
       </w:r>
     </w:p>
     <w:p>
@@ -3296,15 +2823,7 @@
         </w:numPr>
       </w:pPr>
       <w:r>
-        <w:t>/v1/</w:t>
-      </w:r>
-      <w:proofErr w:type="spellStart"/>
-      <w:r>
-        <w:t>api</w:t>
-      </w:r>
-      <w:proofErr w:type="spellEnd"/>
-      <w:r>
-        <w:t>/spots — lists all spots.</w:t>
+        <w:t>/v1/api/spots — lists all spots.</w:t>
       </w:r>
     </w:p>
     <w:p>
@@ -3316,15 +2835,7 @@
         </w:numPr>
       </w:pPr>
       <w:r>
-        <w:t>/v1/</w:t>
-      </w:r>
-      <w:proofErr w:type="spellStart"/>
-      <w:r>
-        <w:t>api</w:t>
-      </w:r>
-      <w:proofErr w:type="spellEnd"/>
-      <w:r>
-        <w:t>/spots/available — lists available spots.</w:t>
+        <w:t>/v1/api/spots/available — lists available spots.</w:t>
       </w:r>
     </w:p>
     <w:p>
@@ -3336,15 +2847,7 @@
         </w:numPr>
       </w:pPr>
       <w:r>
-        <w:t>/v1/</w:t>
-      </w:r>
-      <w:proofErr w:type="spellStart"/>
-      <w:r>
-        <w:t>api</w:t>
-      </w:r>
-      <w:proofErr w:type="spellEnd"/>
-      <w:r>
-        <w:t>/cars/find — gets car’s parking info.</w:t>
+        <w:t>/v1/api/cars/find — gets car’s parking info.</w:t>
       </w:r>
     </w:p>
     <w:p>
@@ -3372,15 +2875,7 @@
         </w:numPr>
       </w:pPr>
       <w:r>
-        <w:t>/v1/</w:t>
-      </w:r>
-      <w:proofErr w:type="spellStart"/>
-      <w:r>
-        <w:t>api</w:t>
-      </w:r>
-      <w:proofErr w:type="spellEnd"/>
-      <w:r>
-        <w:t>/cars/exit — checks out a car, updates spot and car record.</w:t>
+        <w:t>/v1/api/cars/exit — checks out a car, updates spot and car record.</w:t>
       </w:r>
     </w:p>
     <w:p>
@@ -3604,23 +3099,7 @@
                 <w:sz w:val="18"/>
                 <w:szCs w:val="18"/>
               </w:rPr>
-              <w:t>/v1/</w:t>
-            </w:r>
-            <w:proofErr w:type="spellStart"/>
-            <w:r>
-              <w:rPr>
-                <w:sz w:val="18"/>
-                <w:szCs w:val="18"/>
-              </w:rPr>
-              <w:t>api</w:t>
-            </w:r>
-            <w:proofErr w:type="spellEnd"/>
-            <w:r>
-              <w:rPr>
-                <w:sz w:val="18"/>
-                <w:szCs w:val="18"/>
-              </w:rPr>
-              <w:t>/spots</w:t>
+              <w:t>/v1/api/spots</w:t>
             </w:r>
           </w:p>
         </w:tc>
@@ -3701,27 +3180,7 @@
                 <w:sz w:val="20"/>
                 <w:szCs w:val="20"/>
               </w:rPr>
-              <w:t>/v1/</w:t>
-            </w:r>
-            <w:proofErr w:type="spellStart"/>
-            <w:r>
-              <w:rPr>
-                <w:b/>
-                <w:bCs/>
-                <w:sz w:val="20"/>
-                <w:szCs w:val="20"/>
-              </w:rPr>
-              <w:t>api</w:t>
-            </w:r>
-            <w:proofErr w:type="spellEnd"/>
-            <w:r>
-              <w:rPr>
-                <w:b/>
-                <w:bCs/>
-                <w:sz w:val="20"/>
-                <w:szCs w:val="20"/>
-              </w:rPr>
-              <w:t>/spots</w:t>
+              <w:t>/v1/api/spots</w:t>
             </w:r>
           </w:p>
         </w:tc>
@@ -3770,23 +3229,7 @@
                 <w:sz w:val="18"/>
                 <w:szCs w:val="18"/>
               </w:rPr>
-              <w:t>/v1/</w:t>
-            </w:r>
-            <w:proofErr w:type="spellStart"/>
-            <w:r>
-              <w:rPr>
-                <w:sz w:val="18"/>
-                <w:szCs w:val="18"/>
-              </w:rPr>
-              <w:t>api</w:t>
-            </w:r>
-            <w:proofErr w:type="spellEnd"/>
-            <w:r>
-              <w:rPr>
-                <w:sz w:val="18"/>
-                <w:szCs w:val="18"/>
-              </w:rPr>
-              <w:t>/spots/available</w:t>
+              <w:t>/v1/api/spots/available</w:t>
             </w:r>
           </w:p>
         </w:tc>
@@ -3867,47 +3310,7 @@
                 <w:sz w:val="20"/>
                 <w:szCs w:val="20"/>
               </w:rPr>
-              <w:t>/v1/</w:t>
-            </w:r>
-            <w:proofErr w:type="spellStart"/>
-            <w:r>
-              <w:rPr>
-                <w:b/>
-                <w:bCs/>
-                <w:sz w:val="20"/>
-                <w:szCs w:val="20"/>
-              </w:rPr>
-              <w:t>api</w:t>
-            </w:r>
-            <w:proofErr w:type="spellEnd"/>
-            <w:r>
-              <w:rPr>
-                <w:b/>
-                <w:bCs/>
-                <w:sz w:val="20"/>
-                <w:szCs w:val="20"/>
-              </w:rPr>
-              <w:t>/spots/</w:t>
-            </w:r>
-            <w:proofErr w:type="spellStart"/>
-            <w:r>
-              <w:rPr>
-                <w:b/>
-                <w:bCs/>
-                <w:sz w:val="20"/>
-                <w:szCs w:val="20"/>
-              </w:rPr>
-              <w:t>available?type</w:t>
-            </w:r>
-            <w:proofErr w:type="spellEnd"/>
-            <w:r>
-              <w:rPr>
-                <w:b/>
-                <w:bCs/>
-                <w:sz w:val="20"/>
-                <w:szCs w:val="20"/>
-              </w:rPr>
-              <w:t>=compact</w:t>
+              <w:t>/v1/api/spots/available?type=compact</w:t>
             </w:r>
           </w:p>
         </w:tc>
@@ -3959,23 +3362,7 @@
                 <w:sz w:val="18"/>
                 <w:szCs w:val="18"/>
               </w:rPr>
-              <w:t>/v1/</w:t>
-            </w:r>
-            <w:proofErr w:type="spellStart"/>
-            <w:r>
-              <w:rPr>
-                <w:sz w:val="18"/>
-                <w:szCs w:val="18"/>
-              </w:rPr>
-              <w:t>api</w:t>
-            </w:r>
-            <w:proofErr w:type="spellEnd"/>
-            <w:r>
-              <w:rPr>
-                <w:sz w:val="18"/>
-                <w:szCs w:val="18"/>
-              </w:rPr>
-              <w:t>/cars/park</w:t>
+              <w:t>/v1/api/cars/park</w:t>
             </w:r>
           </w:p>
         </w:tc>
@@ -4096,23 +3483,7 @@
                 <w:sz w:val="18"/>
                 <w:szCs w:val="18"/>
               </w:rPr>
-              <w:t>/v1/</w:t>
-            </w:r>
-            <w:proofErr w:type="spellStart"/>
-            <w:r>
-              <w:rPr>
-                <w:sz w:val="18"/>
-                <w:szCs w:val="18"/>
-              </w:rPr>
-              <w:t>api</w:t>
-            </w:r>
-            <w:proofErr w:type="spellEnd"/>
-            <w:r>
-              <w:rPr>
-                <w:sz w:val="18"/>
-                <w:szCs w:val="18"/>
-              </w:rPr>
-              <w:t>/cars/exit</w:t>
+              <w:t>/v1/api/cars/exit</w:t>
             </w:r>
           </w:p>
         </w:tc>
@@ -4236,23 +3607,7 @@
                 <w:sz w:val="18"/>
                 <w:szCs w:val="18"/>
               </w:rPr>
-              <w:t>/v1/</w:t>
-            </w:r>
-            <w:proofErr w:type="spellStart"/>
-            <w:r>
-              <w:rPr>
-                <w:sz w:val="18"/>
-                <w:szCs w:val="18"/>
-              </w:rPr>
-              <w:t>api</w:t>
-            </w:r>
-            <w:proofErr w:type="spellEnd"/>
-            <w:r>
-              <w:rPr>
-                <w:sz w:val="18"/>
-                <w:szCs w:val="18"/>
-              </w:rPr>
-              <w:t>/cars/find</w:t>
+              <w:t>/v1/api/cars/find</w:t>
             </w:r>
           </w:p>
         </w:tc>
@@ -4333,47 +3688,7 @@
                 <w:sz w:val="20"/>
                 <w:szCs w:val="20"/>
               </w:rPr>
-              <w:t>/v1/</w:t>
-            </w:r>
-            <w:proofErr w:type="spellStart"/>
-            <w:r>
-              <w:rPr>
-                <w:b/>
-                <w:bCs/>
-                <w:sz w:val="20"/>
-                <w:szCs w:val="20"/>
-              </w:rPr>
-              <w:t>api</w:t>
-            </w:r>
-            <w:proofErr w:type="spellEnd"/>
-            <w:r>
-              <w:rPr>
-                <w:b/>
-                <w:bCs/>
-                <w:sz w:val="20"/>
-                <w:szCs w:val="20"/>
-              </w:rPr>
-              <w:t>/cars/</w:t>
-            </w:r>
-            <w:proofErr w:type="spellStart"/>
-            <w:r>
-              <w:rPr>
-                <w:b/>
-                <w:bCs/>
-                <w:sz w:val="20"/>
-                <w:szCs w:val="20"/>
-              </w:rPr>
-              <w:t>find?license_plate</w:t>
-            </w:r>
-            <w:proofErr w:type="spellEnd"/>
-            <w:r>
-              <w:rPr>
-                <w:b/>
-                <w:bCs/>
-                <w:sz w:val="20"/>
-                <w:szCs w:val="20"/>
-              </w:rPr>
-              <w:t>=</w:t>
+              <w:t>/v1/api/cars/find?license_plate=</w:t>
             </w:r>
             <w:r>
               <w:rPr>
@@ -4405,23 +3720,7 @@
                 <w:sz w:val="20"/>
                 <w:szCs w:val="20"/>
               </w:rPr>
-              <w:t xml:space="preserve">Car’s parking info (spot, floor, bay, times, fee, </w:t>
-            </w:r>
-            <w:proofErr w:type="spellStart"/>
-            <w:r>
-              <w:rPr>
-                <w:sz w:val="20"/>
-                <w:szCs w:val="20"/>
-              </w:rPr>
-              <w:t>etc</w:t>
-            </w:r>
-            <w:proofErr w:type="spellEnd"/>
-            <w:r>
-              <w:rPr>
-                <w:sz w:val="20"/>
-                <w:szCs w:val="20"/>
-              </w:rPr>
-              <w:t>)</w:t>
+              <w:t>Car’s parking info (spot, floor, bay, times, fee, etc)</w:t>
             </w:r>
           </w:p>
         </w:tc>
@@ -4561,23 +3860,7 @@
           <w:sz w:val="24"/>
           <w:szCs w:val="24"/>
         </w:rPr>
-        <w:t> in MongoDB (</w:t>
-      </w:r>
-      <w:proofErr w:type="spellStart"/>
-      <w:r>
-        <w:rPr>
-          <w:sz w:val="24"/>
-          <w:szCs w:val="24"/>
-        </w:rPr>
-        <w:t>db.floors.drop</w:t>
-      </w:r>
-      <w:proofErr w:type="spellEnd"/>
-      <w:r>
-        <w:rPr>
-          <w:sz w:val="24"/>
-          <w:szCs w:val="24"/>
-        </w:rPr>
-        <w:t>()).</w:t>
+        <w:t> in MongoDB (db.floors.drop()).</w:t>
       </w:r>
     </w:p>
     <w:p>
@@ -4599,19 +3882,8 @@
           <w:sz w:val="24"/>
           <w:szCs w:val="24"/>
         </w:rPr>
-        <w:t>Update models.py </w:t>
-      </w:r>
-      <w:proofErr w:type="spellStart"/>
-      <w:r>
-        <w:rPr>
-          <w:b/>
-          <w:bCs/>
-          <w:sz w:val="24"/>
-          <w:szCs w:val="24"/>
-        </w:rPr>
-        <w:t>Garage.initialize</w:t>
-      </w:r>
-      <w:proofErr w:type="spellEnd"/>
+        <w:t>Update models.py Garage.initialize</w:t>
+      </w:r>
       <w:r>
         <w:rPr>
           <w:sz w:val="24"/>
@@ -4746,25 +4018,7 @@
           <w:sz w:val="14"/>
           <w:szCs w:val="14"/>
         </w:rPr>
-        <w:t xml:space="preserve">        if </w:t>
-      </w:r>
-      <w:proofErr w:type="spellStart"/>
-      <w:r>
-        <w:rPr>
-          <w:rFonts w:ascii="Courier New" w:hAnsi="Courier New" w:cs="Courier New"/>
-          <w:sz w:val="14"/>
-          <w:szCs w:val="14"/>
-        </w:rPr>
-        <w:t>db.floors.count_documents</w:t>
-      </w:r>
-      <w:proofErr w:type="spellEnd"/>
-      <w:r>
-        <w:rPr>
-          <w:rFonts w:ascii="Courier New" w:hAnsi="Courier New" w:cs="Courier New"/>
-          <w:sz w:val="14"/>
-          <w:szCs w:val="14"/>
-        </w:rPr>
-        <w:t>({}) == 0:</w:t>
+        <w:t xml:space="preserve">        if db.floors.count_documents({}) == 0:</w:t>
       </w:r>
     </w:p>
     <w:p>
@@ -4864,25 +4118,7 @@
           <w:sz w:val="14"/>
           <w:szCs w:val="14"/>
         </w:rPr>
-        <w:t xml:space="preserve">                    "</w:t>
-      </w:r>
-      <w:proofErr w:type="spellStart"/>
-      <w:r>
-        <w:rPr>
-          <w:rFonts w:ascii="Courier New" w:hAnsi="Courier New" w:cs="Courier New"/>
-          <w:sz w:val="14"/>
-          <w:szCs w:val="14"/>
-        </w:rPr>
-        <w:t>floor_number</w:t>
-      </w:r>
-      <w:proofErr w:type="spellEnd"/>
-      <w:r>
-        <w:rPr>
-          <w:rFonts w:ascii="Courier New" w:hAnsi="Courier New" w:cs="Courier New"/>
-          <w:sz w:val="14"/>
-          <w:szCs w:val="14"/>
-        </w:rPr>
-        <w:t>": 1,</w:t>
+        <w:t xml:space="preserve">                    "floor_number": 1,</w:t>
       </w:r>
     </w:p>
     <w:p>
@@ -4957,25 +4193,7 @@
           <w:sz w:val="14"/>
           <w:szCs w:val="14"/>
         </w:rPr>
-        <w:t xml:space="preserve">                            "</w:t>
-      </w:r>
-      <w:proofErr w:type="spellStart"/>
-      <w:r>
-        <w:rPr>
-          <w:rFonts w:ascii="Courier New" w:hAnsi="Courier New" w:cs="Courier New"/>
-          <w:sz w:val="14"/>
-          <w:szCs w:val="14"/>
-        </w:rPr>
-        <w:t>bay_id</w:t>
-      </w:r>
-      <w:proofErr w:type="spellEnd"/>
-      <w:r>
-        <w:rPr>
-          <w:rFonts w:ascii="Courier New" w:hAnsi="Courier New" w:cs="Courier New"/>
-          <w:sz w:val="14"/>
-          <w:szCs w:val="14"/>
-        </w:rPr>
-        <w:t>": "A",</w:t>
+        <w:t xml:space="preserve">                            "bay_id": "A",</w:t>
       </w:r>
     </w:p>
     <w:p>
@@ -5025,43 +4243,7 @@
           <w:sz w:val="14"/>
           <w:szCs w:val="14"/>
         </w:rPr>
-        <w:t xml:space="preserve">                                {"</w:t>
-      </w:r>
-      <w:proofErr w:type="spellStart"/>
-      <w:r>
-        <w:rPr>
-          <w:rFonts w:ascii="Courier New" w:hAnsi="Courier New" w:cs="Courier New"/>
-          <w:sz w:val="14"/>
-          <w:szCs w:val="14"/>
-        </w:rPr>
-        <w:t>spot_id</w:t>
-      </w:r>
-      <w:proofErr w:type="spellEnd"/>
-      <w:r>
-        <w:rPr>
-          <w:rFonts w:ascii="Courier New" w:hAnsi="Courier New" w:cs="Courier New"/>
-          <w:sz w:val="14"/>
-          <w:szCs w:val="14"/>
-        </w:rPr>
-        <w:t xml:space="preserve">": f"1-A-{i}", "type": </w:t>
-      </w:r>
-      <w:proofErr w:type="spellStart"/>
-      <w:r>
-        <w:rPr>
-          <w:rFonts w:ascii="Courier New" w:hAnsi="Courier New" w:cs="Courier New"/>
-          <w:sz w:val="14"/>
-          <w:szCs w:val="14"/>
-        </w:rPr>
-        <w:t>SpotType.STANDARD.value</w:t>
-      </w:r>
-      <w:proofErr w:type="spellEnd"/>
-      <w:r>
-        <w:rPr>
-          <w:rFonts w:ascii="Courier New" w:hAnsi="Courier New" w:cs="Courier New"/>
-          <w:sz w:val="14"/>
-          <w:szCs w:val="14"/>
-        </w:rPr>
-        <w:t>,</w:t>
+        <w:t xml:space="preserve">                                {"spot_id": f"1-A-{i}", "type": SpotType.STANDARD.value,</w:t>
       </w:r>
     </w:p>
     <w:p>
@@ -5086,25 +4268,7 @@
           <w:sz w:val="14"/>
           <w:szCs w:val="14"/>
         </w:rPr>
-        <w:t xml:space="preserve">                                 "status": "available"} for </w:t>
-      </w:r>
-      <w:proofErr w:type="spellStart"/>
-      <w:r>
-        <w:rPr>
-          <w:rFonts w:ascii="Courier New" w:hAnsi="Courier New" w:cs="Courier New"/>
-          <w:sz w:val="14"/>
-          <w:szCs w:val="14"/>
-        </w:rPr>
-        <w:t>i</w:t>
-      </w:r>
-      <w:proofErr w:type="spellEnd"/>
-      <w:r>
-        <w:rPr>
-          <w:rFonts w:ascii="Courier New" w:hAnsi="Courier New" w:cs="Courier New"/>
-          <w:sz w:val="14"/>
-          <w:szCs w:val="14"/>
-        </w:rPr>
-        <w:t xml:space="preserve"> in range(1, 6)</w:t>
+        <w:t xml:space="preserve">                                 "status": "available"} for i in range(1, 6)</w:t>
       </w:r>
     </w:p>
     <w:p>
@@ -5204,25 +4368,7 @@
           <w:sz w:val="14"/>
           <w:szCs w:val="14"/>
         </w:rPr>
-        <w:t xml:space="preserve">                            "</w:t>
-      </w:r>
-      <w:proofErr w:type="spellStart"/>
-      <w:r>
-        <w:rPr>
-          <w:rFonts w:ascii="Courier New" w:hAnsi="Courier New" w:cs="Courier New"/>
-          <w:sz w:val="14"/>
-          <w:szCs w:val="14"/>
-        </w:rPr>
-        <w:t>bay_id</w:t>
-      </w:r>
-      <w:proofErr w:type="spellEnd"/>
-      <w:r>
-        <w:rPr>
-          <w:rFonts w:ascii="Courier New" w:hAnsi="Courier New" w:cs="Courier New"/>
-          <w:sz w:val="14"/>
-          <w:szCs w:val="14"/>
-        </w:rPr>
-        <w:t>": "B",</w:t>
+        <w:t xml:space="preserve">                            "bay_id": "B",</w:t>
       </w:r>
     </w:p>
     <w:p>
@@ -5272,43 +4418,7 @@
           <w:sz w:val="14"/>
           <w:szCs w:val="14"/>
         </w:rPr>
-        <w:t xml:space="preserve">                                {"</w:t>
-      </w:r>
-      <w:proofErr w:type="spellStart"/>
-      <w:r>
-        <w:rPr>
-          <w:rFonts w:ascii="Courier New" w:hAnsi="Courier New" w:cs="Courier New"/>
-          <w:sz w:val="14"/>
-          <w:szCs w:val="14"/>
-        </w:rPr>
-        <w:t>spot_id</w:t>
-      </w:r>
-      <w:proofErr w:type="spellEnd"/>
-      <w:r>
-        <w:rPr>
-          <w:rFonts w:ascii="Courier New" w:hAnsi="Courier New" w:cs="Courier New"/>
-          <w:sz w:val="14"/>
-          <w:szCs w:val="14"/>
-        </w:rPr>
-        <w:t xml:space="preserve">": f"1-B-{i}", "type": </w:t>
-      </w:r>
-      <w:proofErr w:type="spellStart"/>
-      <w:r>
-        <w:rPr>
-          <w:rFonts w:ascii="Courier New" w:hAnsi="Courier New" w:cs="Courier New"/>
-          <w:sz w:val="14"/>
-          <w:szCs w:val="14"/>
-        </w:rPr>
-        <w:t>SpotType.COMPACT.value</w:t>
-      </w:r>
-      <w:proofErr w:type="spellEnd"/>
-      <w:r>
-        <w:rPr>
-          <w:rFonts w:ascii="Courier New" w:hAnsi="Courier New" w:cs="Courier New"/>
-          <w:sz w:val="14"/>
-          <w:szCs w:val="14"/>
-        </w:rPr>
-        <w:t>,</w:t>
+        <w:t xml:space="preserve">                                {"spot_id": f"1-B-{i}", "type": SpotType.COMPACT.value,</w:t>
       </w:r>
     </w:p>
     <w:p>
@@ -5333,25 +4443,7 @@
           <w:sz w:val="14"/>
           <w:szCs w:val="14"/>
         </w:rPr>
-        <w:t xml:space="preserve">                                 "status": "available"} for </w:t>
-      </w:r>
-      <w:proofErr w:type="spellStart"/>
-      <w:r>
-        <w:rPr>
-          <w:rFonts w:ascii="Courier New" w:hAnsi="Courier New" w:cs="Courier New"/>
-          <w:sz w:val="14"/>
-          <w:szCs w:val="14"/>
-        </w:rPr>
-        <w:t>i</w:t>
-      </w:r>
-      <w:proofErr w:type="spellEnd"/>
-      <w:r>
-        <w:rPr>
-          <w:rFonts w:ascii="Courier New" w:hAnsi="Courier New" w:cs="Courier New"/>
-          <w:sz w:val="14"/>
-          <w:szCs w:val="14"/>
-        </w:rPr>
-        <w:t xml:space="preserve"> in range(1, 6)</w:t>
+        <w:t xml:space="preserve">                                 "status": "available"} for i in range(1, 6)</w:t>
       </w:r>
     </w:p>
     <w:p>
@@ -5501,25 +4593,7 @@
           <w:sz w:val="14"/>
           <w:szCs w:val="14"/>
         </w:rPr>
-        <w:t xml:space="preserve">                    "</w:t>
-      </w:r>
-      <w:proofErr w:type="spellStart"/>
-      <w:r>
-        <w:rPr>
-          <w:rFonts w:ascii="Courier New" w:hAnsi="Courier New" w:cs="Courier New"/>
-          <w:sz w:val="14"/>
-          <w:szCs w:val="14"/>
-        </w:rPr>
-        <w:t>floor_number</w:t>
-      </w:r>
-      <w:proofErr w:type="spellEnd"/>
-      <w:r>
-        <w:rPr>
-          <w:rFonts w:ascii="Courier New" w:hAnsi="Courier New" w:cs="Courier New"/>
-          <w:sz w:val="14"/>
-          <w:szCs w:val="14"/>
-        </w:rPr>
-        <w:t>": 2,</w:t>
+        <w:t xml:space="preserve">                    "floor_number": 2,</w:t>
       </w:r>
     </w:p>
     <w:p>
@@ -5594,25 +4668,7 @@
           <w:sz w:val="14"/>
           <w:szCs w:val="14"/>
         </w:rPr>
-        <w:t xml:space="preserve">                            "</w:t>
-      </w:r>
-      <w:proofErr w:type="spellStart"/>
-      <w:r>
-        <w:rPr>
-          <w:rFonts w:ascii="Courier New" w:hAnsi="Courier New" w:cs="Courier New"/>
-          <w:sz w:val="14"/>
-          <w:szCs w:val="14"/>
-        </w:rPr>
-        <w:t>bay_id</w:t>
-      </w:r>
-      <w:proofErr w:type="spellEnd"/>
-      <w:r>
-        <w:rPr>
-          <w:rFonts w:ascii="Courier New" w:hAnsi="Courier New" w:cs="Courier New"/>
-          <w:sz w:val="14"/>
-          <w:szCs w:val="14"/>
-        </w:rPr>
-        <w:t>": "C",</w:t>
+        <w:t xml:space="preserve">                            "bay_id": "C",</w:t>
       </w:r>
     </w:p>
     <w:p>
@@ -5662,43 +4718,7 @@
           <w:sz w:val="14"/>
           <w:szCs w:val="14"/>
         </w:rPr>
-        <w:t xml:space="preserve">                                {"</w:t>
-      </w:r>
-      <w:proofErr w:type="spellStart"/>
-      <w:r>
-        <w:rPr>
-          <w:rFonts w:ascii="Courier New" w:hAnsi="Courier New" w:cs="Courier New"/>
-          <w:sz w:val="14"/>
-          <w:szCs w:val="14"/>
-        </w:rPr>
-        <w:t>spot_id</w:t>
-      </w:r>
-      <w:proofErr w:type="spellEnd"/>
-      <w:r>
-        <w:rPr>
-          <w:rFonts w:ascii="Courier New" w:hAnsi="Courier New" w:cs="Courier New"/>
-          <w:sz w:val="14"/>
-          <w:szCs w:val="14"/>
-        </w:rPr>
-        <w:t xml:space="preserve">": f"2-C-{i}", "type": </w:t>
-      </w:r>
-      <w:proofErr w:type="spellStart"/>
-      <w:r>
-        <w:rPr>
-          <w:rFonts w:ascii="Courier New" w:hAnsi="Courier New" w:cs="Courier New"/>
-          <w:sz w:val="14"/>
-          <w:szCs w:val="14"/>
-        </w:rPr>
-        <w:t>SpotType.EV_CHARGING.value</w:t>
-      </w:r>
-      <w:proofErr w:type="spellEnd"/>
-      <w:r>
-        <w:rPr>
-          <w:rFonts w:ascii="Courier New" w:hAnsi="Courier New" w:cs="Courier New"/>
-          <w:sz w:val="14"/>
-          <w:szCs w:val="14"/>
-        </w:rPr>
-        <w:t>,</w:t>
+        <w:t xml:space="preserve">                                {"spot_id": f"2-C-{i}", "type": SpotType.EV_CHARGING.value,</w:t>
       </w:r>
     </w:p>
     <w:p>
@@ -5723,25 +4743,7 @@
           <w:sz w:val="14"/>
           <w:szCs w:val="14"/>
         </w:rPr>
-        <w:t xml:space="preserve">                                 "status": "available"} for </w:t>
-      </w:r>
-      <w:proofErr w:type="spellStart"/>
-      <w:r>
-        <w:rPr>
-          <w:rFonts w:ascii="Courier New" w:hAnsi="Courier New" w:cs="Courier New"/>
-          <w:sz w:val="14"/>
-          <w:szCs w:val="14"/>
-        </w:rPr>
-        <w:t>i</w:t>
-      </w:r>
-      <w:proofErr w:type="spellEnd"/>
-      <w:r>
-        <w:rPr>
-          <w:rFonts w:ascii="Courier New" w:hAnsi="Courier New" w:cs="Courier New"/>
-          <w:sz w:val="14"/>
-          <w:szCs w:val="14"/>
-        </w:rPr>
-        <w:t xml:space="preserve"> in range(1, 6)</w:t>
+        <w:t xml:space="preserve">                                 "status": "available"} for i in range(1, 6)</w:t>
       </w:r>
     </w:p>
     <w:p>
@@ -5841,25 +4843,7 @@
           <w:sz w:val="14"/>
           <w:szCs w:val="14"/>
         </w:rPr>
-        <w:t xml:space="preserve">                            "</w:t>
-      </w:r>
-      <w:proofErr w:type="spellStart"/>
-      <w:r>
-        <w:rPr>
-          <w:rFonts w:ascii="Courier New" w:hAnsi="Courier New" w:cs="Courier New"/>
-          <w:sz w:val="14"/>
-          <w:szCs w:val="14"/>
-        </w:rPr>
-        <w:t>bay_id</w:t>
-      </w:r>
-      <w:proofErr w:type="spellEnd"/>
-      <w:r>
-        <w:rPr>
-          <w:rFonts w:ascii="Courier New" w:hAnsi="Courier New" w:cs="Courier New"/>
-          <w:sz w:val="14"/>
-          <w:szCs w:val="14"/>
-        </w:rPr>
-        <w:t>": "D",</w:t>
+        <w:t xml:space="preserve">                            "bay_id": "D",</w:t>
       </w:r>
     </w:p>
     <w:p>
@@ -5909,43 +4893,7 @@
           <w:sz w:val="14"/>
           <w:szCs w:val="14"/>
         </w:rPr>
-        <w:t xml:space="preserve">                                {"</w:t>
-      </w:r>
-      <w:proofErr w:type="spellStart"/>
-      <w:r>
-        <w:rPr>
-          <w:rFonts w:ascii="Courier New" w:hAnsi="Courier New" w:cs="Courier New"/>
-          <w:sz w:val="14"/>
-          <w:szCs w:val="14"/>
-        </w:rPr>
-        <w:t>spot_id</w:t>
-      </w:r>
-      <w:proofErr w:type="spellEnd"/>
-      <w:r>
-        <w:rPr>
-          <w:rFonts w:ascii="Courier New" w:hAnsi="Courier New" w:cs="Courier New"/>
-          <w:sz w:val="14"/>
-          <w:szCs w:val="14"/>
-        </w:rPr>
-        <w:t xml:space="preserve">": f"2-D-{i}", "type": </w:t>
-      </w:r>
-      <w:proofErr w:type="spellStart"/>
-      <w:r>
-        <w:rPr>
-          <w:rFonts w:ascii="Courier New" w:hAnsi="Courier New" w:cs="Courier New"/>
-          <w:sz w:val="14"/>
-          <w:szCs w:val="14"/>
-        </w:rPr>
-        <w:t>SpotType.OVERSIZED.value</w:t>
-      </w:r>
-      <w:proofErr w:type="spellEnd"/>
-      <w:r>
-        <w:rPr>
-          <w:rFonts w:ascii="Courier New" w:hAnsi="Courier New" w:cs="Courier New"/>
-          <w:sz w:val="14"/>
-          <w:szCs w:val="14"/>
-        </w:rPr>
-        <w:t>,</w:t>
+        <w:t xml:space="preserve">                                {"spot_id": f"2-D-{i}", "type": SpotType.OVERSIZED.value,</w:t>
       </w:r>
     </w:p>
     <w:p>
@@ -5970,25 +4918,7 @@
           <w:sz w:val="14"/>
           <w:szCs w:val="14"/>
         </w:rPr>
-        <w:t xml:space="preserve">                                 "status": "available"} for </w:t>
-      </w:r>
-      <w:proofErr w:type="spellStart"/>
-      <w:r>
-        <w:rPr>
-          <w:rFonts w:ascii="Courier New" w:hAnsi="Courier New" w:cs="Courier New"/>
-          <w:sz w:val="14"/>
-          <w:szCs w:val="14"/>
-        </w:rPr>
-        <w:t>i</w:t>
-      </w:r>
-      <w:proofErr w:type="spellEnd"/>
-      <w:r>
-        <w:rPr>
-          <w:rFonts w:ascii="Courier New" w:hAnsi="Courier New" w:cs="Courier New"/>
-          <w:sz w:val="14"/>
-          <w:szCs w:val="14"/>
-        </w:rPr>
-        <w:t xml:space="preserve"> in range(1, 6)</w:t>
+        <w:t xml:space="preserve">                                 "status": "available"} for i in range(1, 6)</w:t>
       </w:r>
     </w:p>
     <w:p>
@@ -6138,25 +5068,7 @@
           <w:sz w:val="14"/>
           <w:szCs w:val="14"/>
         </w:rPr>
-        <w:t xml:space="preserve">                    "</w:t>
-      </w:r>
-      <w:proofErr w:type="spellStart"/>
-      <w:r>
-        <w:rPr>
-          <w:rFonts w:ascii="Courier New" w:hAnsi="Courier New" w:cs="Courier New"/>
-          <w:sz w:val="14"/>
-          <w:szCs w:val="14"/>
-        </w:rPr>
-        <w:t>floor_number</w:t>
-      </w:r>
-      <w:proofErr w:type="spellEnd"/>
-      <w:r>
-        <w:rPr>
-          <w:rFonts w:ascii="Courier New" w:hAnsi="Courier New" w:cs="Courier New"/>
-          <w:sz w:val="14"/>
-          <w:szCs w:val="14"/>
-        </w:rPr>
-        <w:t>": 3,</w:t>
+        <w:t xml:space="preserve">                    "floor_number": 3,</w:t>
       </w:r>
     </w:p>
     <w:p>
@@ -6231,25 +5143,7 @@
           <w:sz w:val="14"/>
           <w:szCs w:val="14"/>
         </w:rPr>
-        <w:t xml:space="preserve">                            "</w:t>
-      </w:r>
-      <w:proofErr w:type="spellStart"/>
-      <w:r>
-        <w:rPr>
-          <w:rFonts w:ascii="Courier New" w:hAnsi="Courier New" w:cs="Courier New"/>
-          <w:sz w:val="14"/>
-          <w:szCs w:val="14"/>
-        </w:rPr>
-        <w:t>bay_id</w:t>
-      </w:r>
-      <w:proofErr w:type="spellEnd"/>
-      <w:r>
-        <w:rPr>
-          <w:rFonts w:ascii="Courier New" w:hAnsi="Courier New" w:cs="Courier New"/>
-          <w:sz w:val="14"/>
-          <w:szCs w:val="14"/>
-        </w:rPr>
-        <w:t>": "E",</w:t>
+        <w:t xml:space="preserve">                            "bay_id": "E",</w:t>
       </w:r>
     </w:p>
     <w:p>
@@ -6299,43 +5193,7 @@
           <w:sz w:val="14"/>
           <w:szCs w:val="14"/>
         </w:rPr>
-        <w:t xml:space="preserve">                                {"</w:t>
-      </w:r>
-      <w:proofErr w:type="spellStart"/>
-      <w:r>
-        <w:rPr>
-          <w:rFonts w:ascii="Courier New" w:hAnsi="Courier New" w:cs="Courier New"/>
-          <w:sz w:val="14"/>
-          <w:szCs w:val="14"/>
-        </w:rPr>
-        <w:t>spot_id</w:t>
-      </w:r>
-      <w:proofErr w:type="spellEnd"/>
-      <w:r>
-        <w:rPr>
-          <w:rFonts w:ascii="Courier New" w:hAnsi="Courier New" w:cs="Courier New"/>
-          <w:sz w:val="14"/>
-          <w:szCs w:val="14"/>
-        </w:rPr>
-        <w:t xml:space="preserve">": f"3-E-{i}", "type": </w:t>
-      </w:r>
-      <w:proofErr w:type="spellStart"/>
-      <w:r>
-        <w:rPr>
-          <w:rFonts w:ascii="Courier New" w:hAnsi="Courier New" w:cs="Courier New"/>
-          <w:sz w:val="14"/>
-          <w:szCs w:val="14"/>
-        </w:rPr>
-        <w:t>SpotType.STANDARD.value</w:t>
-      </w:r>
-      <w:proofErr w:type="spellEnd"/>
-      <w:r>
-        <w:rPr>
-          <w:rFonts w:ascii="Courier New" w:hAnsi="Courier New" w:cs="Courier New"/>
-          <w:sz w:val="14"/>
-          <w:szCs w:val="14"/>
-        </w:rPr>
-        <w:t>,</w:t>
+        <w:t xml:space="preserve">                                {"spot_id": f"3-E-{i}", "type": SpotType.STANDARD.value,</w:t>
       </w:r>
     </w:p>
     <w:p>
@@ -6360,25 +5218,7 @@
           <w:sz w:val="14"/>
           <w:szCs w:val="14"/>
         </w:rPr>
-        <w:t xml:space="preserve">                                 "status": "available"} for </w:t>
-      </w:r>
-      <w:proofErr w:type="spellStart"/>
-      <w:r>
-        <w:rPr>
-          <w:rFonts w:ascii="Courier New" w:hAnsi="Courier New" w:cs="Courier New"/>
-          <w:sz w:val="14"/>
-          <w:szCs w:val="14"/>
-        </w:rPr>
-        <w:t>i</w:t>
-      </w:r>
-      <w:proofErr w:type="spellEnd"/>
-      <w:r>
-        <w:rPr>
-          <w:rFonts w:ascii="Courier New" w:hAnsi="Courier New" w:cs="Courier New"/>
-          <w:sz w:val="14"/>
-          <w:szCs w:val="14"/>
-        </w:rPr>
-        <w:t xml:space="preserve"> in range(1, 6)</w:t>
+        <w:t xml:space="preserve">                                 "status": "available"} for i in range(1, 6)</w:t>
       </w:r>
     </w:p>
     <w:p>
@@ -6478,25 +5318,7 @@
           <w:sz w:val="14"/>
           <w:szCs w:val="14"/>
         </w:rPr>
-        <w:t xml:space="preserve">                            "</w:t>
-      </w:r>
-      <w:proofErr w:type="spellStart"/>
-      <w:r>
-        <w:rPr>
-          <w:rFonts w:ascii="Courier New" w:hAnsi="Courier New" w:cs="Courier New"/>
-          <w:sz w:val="14"/>
-          <w:szCs w:val="14"/>
-        </w:rPr>
-        <w:t>bay_id</w:t>
-      </w:r>
-      <w:proofErr w:type="spellEnd"/>
-      <w:r>
-        <w:rPr>
-          <w:rFonts w:ascii="Courier New" w:hAnsi="Courier New" w:cs="Courier New"/>
-          <w:sz w:val="14"/>
-          <w:szCs w:val="14"/>
-        </w:rPr>
-        <w:t>": "F",</w:t>
+        <w:t xml:space="preserve">                            "bay_id": "F",</w:t>
       </w:r>
     </w:p>
     <w:p>
@@ -6546,43 +5368,7 @@
           <w:sz w:val="14"/>
           <w:szCs w:val="14"/>
         </w:rPr>
-        <w:t xml:space="preserve">                                {"</w:t>
-      </w:r>
-      <w:proofErr w:type="spellStart"/>
-      <w:r>
-        <w:rPr>
-          <w:rFonts w:ascii="Courier New" w:hAnsi="Courier New" w:cs="Courier New"/>
-          <w:sz w:val="14"/>
-          <w:szCs w:val="14"/>
-        </w:rPr>
-        <w:t>spot_id</w:t>
-      </w:r>
-      <w:proofErr w:type="spellEnd"/>
-      <w:r>
-        <w:rPr>
-          <w:rFonts w:ascii="Courier New" w:hAnsi="Courier New" w:cs="Courier New"/>
-          <w:sz w:val="14"/>
-          <w:szCs w:val="14"/>
-        </w:rPr>
-        <w:t xml:space="preserve">": f"3-F-{i}", "type": </w:t>
-      </w:r>
-      <w:proofErr w:type="spellStart"/>
-      <w:r>
-        <w:rPr>
-          <w:rFonts w:ascii="Courier New" w:hAnsi="Courier New" w:cs="Courier New"/>
-          <w:sz w:val="14"/>
-          <w:szCs w:val="14"/>
-        </w:rPr>
-        <w:t>SpotType.OVERSIZED.value</w:t>
-      </w:r>
-      <w:proofErr w:type="spellEnd"/>
-      <w:r>
-        <w:rPr>
-          <w:rFonts w:ascii="Courier New" w:hAnsi="Courier New" w:cs="Courier New"/>
-          <w:sz w:val="14"/>
-          <w:szCs w:val="14"/>
-        </w:rPr>
-        <w:t>,</w:t>
+        <w:t xml:space="preserve">                                {"spot_id": f"3-F-{i}", "type": SpotType.OVERSIZED.value,</w:t>
       </w:r>
     </w:p>
     <w:p>
@@ -6607,25 +5393,7 @@
           <w:sz w:val="14"/>
           <w:szCs w:val="14"/>
         </w:rPr>
-        <w:t xml:space="preserve">                                 "status": "available"} for </w:t>
-      </w:r>
-      <w:proofErr w:type="spellStart"/>
-      <w:r>
-        <w:rPr>
-          <w:rFonts w:ascii="Courier New" w:hAnsi="Courier New" w:cs="Courier New"/>
-          <w:sz w:val="14"/>
-          <w:szCs w:val="14"/>
-        </w:rPr>
-        <w:t>i</w:t>
-      </w:r>
-      <w:proofErr w:type="spellEnd"/>
-      <w:r>
-        <w:rPr>
-          <w:rFonts w:ascii="Courier New" w:hAnsi="Courier New" w:cs="Courier New"/>
-          <w:sz w:val="14"/>
-          <w:szCs w:val="14"/>
-        </w:rPr>
-        <w:t xml:space="preserve"> in range(1, 6)</w:t>
+        <w:t xml:space="preserve">                                 "status": "available"} for i in range(1, 6)</w:t>
       </w:r>
     </w:p>
     <w:p>
@@ -6775,25 +5543,7 @@
           <w:sz w:val="14"/>
           <w:szCs w:val="14"/>
         </w:rPr>
-        <w:t xml:space="preserve">            </w:t>
-      </w:r>
-      <w:proofErr w:type="spellStart"/>
-      <w:r>
-        <w:rPr>
-          <w:rFonts w:ascii="Courier New" w:hAnsi="Courier New" w:cs="Courier New"/>
-          <w:sz w:val="14"/>
-          <w:szCs w:val="14"/>
-        </w:rPr>
-        <w:t>db.floors.insert_many</w:t>
-      </w:r>
-      <w:proofErr w:type="spellEnd"/>
-      <w:r>
-        <w:rPr>
-          <w:rFonts w:ascii="Courier New" w:hAnsi="Courier New" w:cs="Courier New"/>
-          <w:sz w:val="14"/>
-          <w:szCs w:val="14"/>
-        </w:rPr>
-        <w:t>(floors)</w:t>
+        <w:t xml:space="preserve">            db.floors.insert_many(floors)</w:t>
       </w:r>
     </w:p>
     <w:p>
@@ -6888,23 +5638,13 @@
           <w:szCs w:val="14"/>
         </w:rPr>
       </w:pPr>
-      <w:proofErr w:type="spellStart"/>
-      <w:r>
-        <w:rPr>
-          <w:rFonts w:ascii="Courier New" w:hAnsi="Courier New" w:cs="Courier New"/>
-          <w:sz w:val="14"/>
-          <w:szCs w:val="14"/>
-        </w:rPr>
-        <w:t>db.floors.insertOne</w:t>
-      </w:r>
-      <w:proofErr w:type="spellEnd"/>
-      <w:r>
-        <w:rPr>
-          <w:rFonts w:ascii="Courier New" w:hAnsi="Courier New" w:cs="Courier New"/>
-          <w:sz w:val="14"/>
-          <w:szCs w:val="14"/>
-        </w:rPr>
-        <w:t>({</w:t>
+      <w:r>
+        <w:rPr>
+          <w:rFonts w:ascii="Courier New" w:hAnsi="Courier New" w:cs="Courier New"/>
+          <w:sz w:val="14"/>
+          <w:szCs w:val="14"/>
+        </w:rPr>
+        <w:t>db.floors.insertOne({</w:t>
       </w:r>
     </w:p>
     <w:p>
@@ -6929,43 +5669,15 @@
           <w:sz w:val="14"/>
           <w:szCs w:val="14"/>
         </w:rPr>
-        <w:t xml:space="preserve">    "</w:t>
-      </w:r>
-      <w:proofErr w:type="spellStart"/>
-      <w:r>
-        <w:rPr>
-          <w:rFonts w:ascii="Courier New" w:hAnsi="Courier New" w:cs="Courier New"/>
-          <w:sz w:val="14"/>
-          <w:szCs w:val="14"/>
-        </w:rPr>
-        <w:t>floor_number</w:t>
-      </w:r>
-      <w:proofErr w:type="spellEnd"/>
-      <w:r>
-        <w:rPr>
-          <w:rFonts w:ascii="Courier New" w:hAnsi="Courier New" w:cs="Courier New"/>
-          <w:sz w:val="14"/>
-          <w:szCs w:val="14"/>
-        </w:rPr>
-        <w:t xml:space="preserve">": </w:t>
-      </w:r>
-      <w:proofErr w:type="spellStart"/>
-      <w:r>
-        <w:rPr>
-          <w:rFonts w:ascii="Courier New" w:hAnsi="Courier New" w:cs="Courier New"/>
-          <w:sz w:val="14"/>
-          <w:szCs w:val="14"/>
-        </w:rPr>
-        <w:t>NumberInt</w:t>
-      </w:r>
-      <w:proofErr w:type="spellEnd"/>
-      <w:r>
-        <w:rPr>
-          <w:rFonts w:ascii="Courier New" w:hAnsi="Courier New" w:cs="Courier New"/>
-          <w:sz w:val="14"/>
-          <w:szCs w:val="14"/>
-        </w:rPr>
-        <w:t>(3)</w:t>
+        <w:t xml:space="preserve">    "floor_number": </w:t>
+      </w:r>
+      <w:r>
+        <w:rPr>
+          <w:rFonts w:ascii="Courier New" w:hAnsi="Courier New" w:cs="Courier New"/>
+          <w:sz w:val="14"/>
+          <w:szCs w:val="14"/>
+        </w:rPr>
+        <w:t>NumberInt(3)</w:t>
       </w:r>
       <w:r>
         <w:rPr>
@@ -7048,25 +5760,7 @@
           <w:sz w:val="14"/>
           <w:szCs w:val="14"/>
         </w:rPr>
-        <w:t xml:space="preserve">            "</w:t>
-      </w:r>
-      <w:proofErr w:type="spellStart"/>
-      <w:r>
-        <w:rPr>
-          <w:rFonts w:ascii="Courier New" w:hAnsi="Courier New" w:cs="Courier New"/>
-          <w:sz w:val="14"/>
-          <w:szCs w:val="14"/>
-        </w:rPr>
-        <w:t>bay_id</w:t>
-      </w:r>
-      <w:proofErr w:type="spellEnd"/>
-      <w:r>
-        <w:rPr>
-          <w:rFonts w:ascii="Courier New" w:hAnsi="Courier New" w:cs="Courier New"/>
-          <w:sz w:val="14"/>
-          <w:szCs w:val="14"/>
-        </w:rPr>
-        <w:t>": "E",</w:t>
+        <w:t xml:space="preserve">            "bay_id": "E",</w:t>
       </w:r>
     </w:p>
     <w:p>
@@ -7141,25 +5835,7 @@
           <w:sz w:val="14"/>
           <w:szCs w:val="14"/>
         </w:rPr>
-        <w:t xml:space="preserve">                    "</w:t>
-      </w:r>
-      <w:proofErr w:type="spellStart"/>
-      <w:r>
-        <w:rPr>
-          <w:rFonts w:ascii="Courier New" w:hAnsi="Courier New" w:cs="Courier New"/>
-          <w:sz w:val="14"/>
-          <w:szCs w:val="14"/>
-        </w:rPr>
-        <w:t>spot_id</w:t>
-      </w:r>
-      <w:proofErr w:type="spellEnd"/>
-      <w:r>
-        <w:rPr>
-          <w:rFonts w:ascii="Courier New" w:hAnsi="Courier New" w:cs="Courier New"/>
-          <w:sz w:val="14"/>
-          <w:szCs w:val="14"/>
-        </w:rPr>
-        <w:t>": "3-E-1",</w:t>
+        <w:t xml:space="preserve">                    "spot_id": "3-E-1",</w:t>
       </w:r>
     </w:p>
     <w:p>
@@ -7186,7 +5862,6 @@
         </w:rPr>
         <w:t xml:space="preserve">                    "type": "</w:t>
       </w:r>
-      <w:proofErr w:type="spellStart"/>
       <w:r>
         <w:rPr>
           <w:rFonts w:ascii="Courier New" w:hAnsi="Courier New" w:cs="Courier New"/>
@@ -7195,7 +5870,6 @@
         </w:rPr>
         <w:t>ev_charging</w:t>
       </w:r>
-      <w:proofErr w:type="spellEnd"/>
       <w:r>
         <w:rPr>
           <w:rFonts w:ascii="Courier New" w:hAnsi="Courier New" w:cs="Courier New"/>
@@ -7302,25 +5976,7 @@
           <w:sz w:val="14"/>
           <w:szCs w:val="14"/>
         </w:rPr>
-        <w:t xml:space="preserve">                    "</w:t>
-      </w:r>
-      <w:proofErr w:type="spellStart"/>
-      <w:r>
-        <w:rPr>
-          <w:rFonts w:ascii="Courier New" w:hAnsi="Courier New" w:cs="Courier New"/>
-          <w:sz w:val="14"/>
-          <w:szCs w:val="14"/>
-        </w:rPr>
-        <w:t>spot_id</w:t>
-      </w:r>
-      <w:proofErr w:type="spellEnd"/>
-      <w:r>
-        <w:rPr>
-          <w:rFonts w:ascii="Courier New" w:hAnsi="Courier New" w:cs="Courier New"/>
-          <w:sz w:val="14"/>
-          <w:szCs w:val="14"/>
-        </w:rPr>
-        <w:t>": "3-E-2",</w:t>
+        <w:t xml:space="preserve">                    "spot_id": "3-E-2",</w:t>
       </w:r>
     </w:p>
     <w:p>
@@ -7347,7 +6003,6 @@
         </w:rPr>
         <w:t xml:space="preserve">                    "type": "</w:t>
       </w:r>
-      <w:proofErr w:type="spellStart"/>
       <w:r>
         <w:rPr>
           <w:rFonts w:ascii="Courier New" w:hAnsi="Courier New" w:cs="Courier New"/>
@@ -7356,7 +6011,6 @@
         </w:rPr>
         <w:t>ev_charging</w:t>
       </w:r>
-      <w:proofErr w:type="spellEnd"/>
       <w:r>
         <w:rPr>
           <w:rFonts w:ascii="Courier New" w:hAnsi="Courier New" w:cs="Courier New"/>
@@ -7463,25 +6117,7 @@
           <w:sz w:val="14"/>
           <w:szCs w:val="14"/>
         </w:rPr>
-        <w:t xml:space="preserve">                    "</w:t>
-      </w:r>
-      <w:proofErr w:type="spellStart"/>
-      <w:r>
-        <w:rPr>
-          <w:rFonts w:ascii="Courier New" w:hAnsi="Courier New" w:cs="Courier New"/>
-          <w:sz w:val="14"/>
-          <w:szCs w:val="14"/>
-        </w:rPr>
-        <w:t>spot_id</w:t>
-      </w:r>
-      <w:proofErr w:type="spellEnd"/>
-      <w:r>
-        <w:rPr>
-          <w:rFonts w:ascii="Courier New" w:hAnsi="Courier New" w:cs="Courier New"/>
-          <w:sz w:val="14"/>
-          <w:szCs w:val="14"/>
-        </w:rPr>
-        <w:t>": "3-E-3",</w:t>
+        <w:t xml:space="preserve">                    "spot_id": "3-E-3",</w:t>
       </w:r>
     </w:p>
     <w:p>
@@ -7622,25 +6258,7 @@
           <w:sz w:val="14"/>
           <w:szCs w:val="14"/>
         </w:rPr>
-        <w:t xml:space="preserve">                    "</w:t>
-      </w:r>
-      <w:proofErr w:type="spellStart"/>
-      <w:r>
-        <w:rPr>
-          <w:rFonts w:ascii="Courier New" w:hAnsi="Courier New" w:cs="Courier New"/>
-          <w:sz w:val="14"/>
-          <w:szCs w:val="14"/>
-        </w:rPr>
-        <w:t>spot_id</w:t>
-      </w:r>
-      <w:proofErr w:type="spellEnd"/>
-      <w:r>
-        <w:rPr>
-          <w:rFonts w:ascii="Courier New" w:hAnsi="Courier New" w:cs="Courier New"/>
-          <w:sz w:val="14"/>
-          <w:szCs w:val="14"/>
-        </w:rPr>
-        <w:t>": "3-E-4",</w:t>
+        <w:t xml:space="preserve">                    "spot_id": "3-E-4",</w:t>
       </w:r>
     </w:p>
     <w:p>
@@ -7781,25 +6399,7 @@
           <w:sz w:val="14"/>
           <w:szCs w:val="14"/>
         </w:rPr>
-        <w:t xml:space="preserve">                    "</w:t>
-      </w:r>
-      <w:proofErr w:type="spellStart"/>
-      <w:r>
-        <w:rPr>
-          <w:rFonts w:ascii="Courier New" w:hAnsi="Courier New" w:cs="Courier New"/>
-          <w:sz w:val="14"/>
-          <w:szCs w:val="14"/>
-        </w:rPr>
-        <w:t>spot_id</w:t>
-      </w:r>
-      <w:proofErr w:type="spellEnd"/>
-      <w:r>
-        <w:rPr>
-          <w:rFonts w:ascii="Courier New" w:hAnsi="Courier New" w:cs="Courier New"/>
-          <w:sz w:val="14"/>
-          <w:szCs w:val="14"/>
-        </w:rPr>
-        <w:t>": "3-E-5",</w:t>
+        <w:t xml:space="preserve">                    "spot_id": "3-E-5",</w:t>
       </w:r>
     </w:p>
     <w:p>
@@ -7827,15 +6427,12 @@
         <w:t xml:space="preserve">                    "type": "</w:t>
       </w:r>
       <w:r>
-        <w:t xml:space="preserve"> </w:t>
-      </w:r>
-      <w:r>
-        <w:rPr>
-          <w:rFonts w:ascii="Courier New" w:hAnsi="Courier New" w:cs="Courier New"/>
-          <w:sz w:val="14"/>
-          <w:szCs w:val="14"/>
-        </w:rPr>
-        <w:t xml:space="preserve">standard </w:t>
+        <w:rPr>
+          <w:rFonts w:ascii="Courier New" w:hAnsi="Courier New" w:cs="Courier New"/>
+          <w:sz w:val="14"/>
+          <w:szCs w:val="14"/>
+        </w:rPr>
+        <w:t>standard</w:t>
       </w:r>
       <w:r>
         <w:rPr>
@@ -7993,25 +6590,7 @@
           <w:sz w:val="14"/>
           <w:szCs w:val="14"/>
         </w:rPr>
-        <w:t xml:space="preserve">            "</w:t>
-      </w:r>
-      <w:proofErr w:type="spellStart"/>
-      <w:r>
-        <w:rPr>
-          <w:rFonts w:ascii="Courier New" w:hAnsi="Courier New" w:cs="Courier New"/>
-          <w:sz w:val="14"/>
-          <w:szCs w:val="14"/>
-        </w:rPr>
-        <w:t>bay_id</w:t>
-      </w:r>
-      <w:proofErr w:type="spellEnd"/>
-      <w:r>
-        <w:rPr>
-          <w:rFonts w:ascii="Courier New" w:hAnsi="Courier New" w:cs="Courier New"/>
-          <w:sz w:val="14"/>
-          <w:szCs w:val="14"/>
-        </w:rPr>
-        <w:t>": "F",</w:t>
+        <w:t xml:space="preserve">            "bay_id": "F",</w:t>
       </w:r>
     </w:p>
     <w:p>
@@ -8086,25 +6665,7 @@
           <w:sz w:val="14"/>
           <w:szCs w:val="14"/>
         </w:rPr>
-        <w:t xml:space="preserve">                    "</w:t>
-      </w:r>
-      <w:proofErr w:type="spellStart"/>
-      <w:r>
-        <w:rPr>
-          <w:rFonts w:ascii="Courier New" w:hAnsi="Courier New" w:cs="Courier New"/>
-          <w:sz w:val="14"/>
-          <w:szCs w:val="14"/>
-        </w:rPr>
-        <w:t>spot_id</w:t>
-      </w:r>
-      <w:proofErr w:type="spellEnd"/>
-      <w:r>
-        <w:rPr>
-          <w:rFonts w:ascii="Courier New" w:hAnsi="Courier New" w:cs="Courier New"/>
-          <w:sz w:val="14"/>
-          <w:szCs w:val="14"/>
-        </w:rPr>
-        <w:t>": "3-F-1",</w:t>
+        <w:t xml:space="preserve">                    "spot_id": "3-F-1",</w:t>
       </w:r>
     </w:p>
     <w:p>
@@ -8245,25 +6806,7 @@
           <w:sz w:val="14"/>
           <w:szCs w:val="14"/>
         </w:rPr>
-        <w:t xml:space="preserve">                    "</w:t>
-      </w:r>
-      <w:proofErr w:type="spellStart"/>
-      <w:r>
-        <w:rPr>
-          <w:rFonts w:ascii="Courier New" w:hAnsi="Courier New" w:cs="Courier New"/>
-          <w:sz w:val="14"/>
-          <w:szCs w:val="14"/>
-        </w:rPr>
-        <w:t>spot_id</w:t>
-      </w:r>
-      <w:proofErr w:type="spellEnd"/>
-      <w:r>
-        <w:rPr>
-          <w:rFonts w:ascii="Courier New" w:hAnsi="Courier New" w:cs="Courier New"/>
-          <w:sz w:val="14"/>
-          <w:szCs w:val="14"/>
-        </w:rPr>
-        <w:t>": "3-F-2",</w:t>
+        <w:t xml:space="preserve">                    "spot_id": "3-F-2",</w:t>
       </w:r>
     </w:p>
     <w:p>
@@ -8388,25 +6931,7 @@
           <w:sz w:val="14"/>
           <w:szCs w:val="14"/>
         </w:rPr>
-        <w:t xml:space="preserve">                    "</w:t>
-      </w:r>
-      <w:proofErr w:type="spellStart"/>
-      <w:r>
-        <w:rPr>
-          <w:rFonts w:ascii="Courier New" w:hAnsi="Courier New" w:cs="Courier New"/>
-          <w:sz w:val="14"/>
-          <w:szCs w:val="14"/>
-        </w:rPr>
-        <w:t>spot_id</w:t>
-      </w:r>
-      <w:proofErr w:type="spellEnd"/>
-      <w:r>
-        <w:rPr>
-          <w:rFonts w:ascii="Courier New" w:hAnsi="Courier New" w:cs="Courier New"/>
-          <w:sz w:val="14"/>
-          <w:szCs w:val="14"/>
-        </w:rPr>
-        <w:t>": "3-F-3",</w:t>
+        <w:t xml:space="preserve">                    "spot_id": "3-F-3",</w:t>
       </w:r>
     </w:p>
     <w:p>
@@ -8547,25 +7072,7 @@
           <w:sz w:val="14"/>
           <w:szCs w:val="14"/>
         </w:rPr>
-        <w:t xml:space="preserve">                    "</w:t>
-      </w:r>
-      <w:proofErr w:type="spellStart"/>
-      <w:r>
-        <w:rPr>
-          <w:rFonts w:ascii="Courier New" w:hAnsi="Courier New" w:cs="Courier New"/>
-          <w:sz w:val="14"/>
-          <w:szCs w:val="14"/>
-        </w:rPr>
-        <w:t>spot_id</w:t>
-      </w:r>
-      <w:proofErr w:type="spellEnd"/>
-      <w:r>
-        <w:rPr>
-          <w:rFonts w:ascii="Courier New" w:hAnsi="Courier New" w:cs="Courier New"/>
-          <w:sz w:val="14"/>
-          <w:szCs w:val="14"/>
-        </w:rPr>
-        <w:t>": "3-F-4",</w:t>
+        <w:t xml:space="preserve">                    "spot_id": "3-F-4",</w:t>
       </w:r>
     </w:p>
     <w:p>
@@ -8706,25 +7213,7 @@
           <w:sz w:val="14"/>
           <w:szCs w:val="14"/>
         </w:rPr>
-        <w:t xml:space="preserve">                    "</w:t>
-      </w:r>
-      <w:proofErr w:type="spellStart"/>
-      <w:r>
-        <w:rPr>
-          <w:rFonts w:ascii="Courier New" w:hAnsi="Courier New" w:cs="Courier New"/>
-          <w:sz w:val="14"/>
-          <w:szCs w:val="14"/>
-        </w:rPr>
-        <w:t>spot_id</w:t>
-      </w:r>
-      <w:proofErr w:type="spellEnd"/>
-      <w:r>
-        <w:rPr>
-          <w:rFonts w:ascii="Courier New" w:hAnsi="Courier New" w:cs="Courier New"/>
-          <w:sz w:val="14"/>
-          <w:szCs w:val="14"/>
-        </w:rPr>
-        <w:t>": "3-F-5",</w:t>
+        <w:t xml:space="preserve">                    "spot_id": "3-F-5",</w:t>
       </w:r>
     </w:p>
     <w:p>
@@ -8986,34 +7475,13 @@
           <w:b/>
           <w:bCs/>
         </w:rPr>
-        <w:t>Add a </w:t>
-      </w:r>
-      <w:proofErr w:type="spellStart"/>
-      <w:r>
-        <w:rPr>
-          <w:b/>
-          <w:bCs/>
-        </w:rPr>
-        <w:t>garage_id</w:t>
-      </w:r>
-      <w:proofErr w:type="spellEnd"/>
-      <w:r>
-        <w:rPr>
-          <w:b/>
-          <w:bCs/>
-        </w:rPr>
-        <w:t> field</w:t>
+        <w:t>Add a garage_id field</w:t>
       </w:r>
       <w:r>
         <w:t xml:space="preserve"> (or name, code, </w:t>
       </w:r>
-      <w:proofErr w:type="spellStart"/>
-      <w:r>
-        <w:t>parking_lot_id</w:t>
-      </w:r>
-      <w:proofErr w:type="spellEnd"/>
-      <w:r>
-        <w:t xml:space="preserve"> </w:t>
+      <w:r>
+        <w:t xml:space="preserve">parking_lot_id </w:t>
       </w:r>
       <w:r>
         <w:t>etc.) to each floor, bay, spot, and car document in MongoDB.</w:t>
@@ -9066,15 +7534,7 @@
         <w:t>Each floor</w:t>
       </w:r>
       <w:r>
-        <w:t> document should reference its parent garage via </w:t>
-      </w:r>
-      <w:proofErr w:type="spellStart"/>
-      <w:r>
-        <w:t>garage_id</w:t>
-      </w:r>
-      <w:proofErr w:type="spellEnd"/>
-      <w:r>
-        <w:t>.</w:t>
+        <w:t> document should reference its parent garage via garage_id.</w:t>
       </w:r>
     </w:p>
     <w:p>
@@ -9106,23 +7566,7 @@
           <w:b/>
           <w:bCs/>
         </w:rPr>
-        <w:t>All queries must include a </w:t>
-      </w:r>
-      <w:proofErr w:type="spellStart"/>
-      <w:r>
-        <w:rPr>
-          <w:b/>
-          <w:bCs/>
-        </w:rPr>
-        <w:t>garage_id</w:t>
-      </w:r>
-      <w:proofErr w:type="spellEnd"/>
-      <w:r>
-        <w:rPr>
-          <w:b/>
-          <w:bCs/>
-        </w:rPr>
-        <w:t> filter</w:t>
+        <w:t>All queries must include a garage_id filter</w:t>
       </w:r>
       <w:r>
         <w:t>.</w:t>
@@ -9137,23 +7581,7 @@
         </w:numPr>
       </w:pPr>
       <w:r>
-        <w:t>For example, when fetching floors or spots, add {"</w:t>
-      </w:r>
-      <w:proofErr w:type="spellStart"/>
-      <w:r>
-        <w:t>garage_id</w:t>
-      </w:r>
-      <w:proofErr w:type="spellEnd"/>
-      <w:r>
-        <w:t>": &lt;</w:t>
-      </w:r>
-      <w:proofErr w:type="spellStart"/>
-      <w:r>
-        <w:t>garage_id</w:t>
-      </w:r>
-      <w:proofErr w:type="spellEnd"/>
-      <w:r>
-        <w:t>&gt;} to the MongoDB query.</w:t>
+        <w:t>For example, when fetching floors or spots, add {"garage_id": &lt;garage_id&gt;} to the MongoDB query.</w:t>
       </w:r>
     </w:p>
     <w:p>
@@ -9259,15 +7687,7 @@
         </w:numPr>
       </w:pPr>
       <w:r>
-        <w:t>Pass the selected </w:t>
-      </w:r>
-      <w:proofErr w:type="spellStart"/>
-      <w:r>
-        <w:t>garage_id</w:t>
-      </w:r>
-      <w:proofErr w:type="spellEnd"/>
-      <w:r>
-        <w:t> to all API calls.</w:t>
+        <w:t>Pass the selected garage_id to all API calls.</w:t>
       </w:r>
     </w:p>
     <w:p>
@@ -9342,15 +7762,7 @@
         </w:numPr>
       </w:pPr>
       <w:r>
-        <w:t>When adding floors, associate them with the parent </w:t>
-      </w:r>
-      <w:proofErr w:type="spellStart"/>
-      <w:r>
-        <w:t>garage_id</w:t>
-      </w:r>
-      <w:proofErr w:type="spellEnd"/>
-      <w:r>
-        <w:t>.</w:t>
+        <w:t>When adding floors, associate them with the parent garage_id.</w:t>
       </w:r>
     </w:p>
     <w:p>
@@ -9426,15 +7838,7 @@
         </w:numPr>
       </w:pPr>
       <w:r>
-        <w:t>Just add more floor documents with the same </w:t>
-      </w:r>
-      <w:proofErr w:type="spellStart"/>
-      <w:r>
-        <w:t>garage_id</w:t>
-      </w:r>
-      <w:proofErr w:type="spellEnd"/>
-      <w:r>
-        <w:t>.</w:t>
+        <w:t>Just add more floor documents with the same garage_id.</w:t>
       </w:r>
     </w:p>
     <w:p>
@@ -9450,23 +7854,7 @@
           <w:b/>
           <w:bCs/>
         </w:rPr>
-        <w:t>Ensure the </w:t>
-      </w:r>
-      <w:proofErr w:type="spellStart"/>
-      <w:r>
-        <w:rPr>
-          <w:b/>
-          <w:bCs/>
-        </w:rPr>
-        <w:t>floor_number</w:t>
-      </w:r>
-      <w:proofErr w:type="spellEnd"/>
-      <w:r>
-        <w:rPr>
-          <w:b/>
-          <w:bCs/>
-        </w:rPr>
-        <w:t> is unique within each garage</w:t>
+        <w:t>Ensure the floor_number is unique within each garage</w:t>
       </w:r>
       <w:r>
         <w:t>.</w:t>
@@ -9532,15 +7920,7 @@
         </w:numPr>
       </w:pPr>
       <w:r>
-        <w:t>Insert a new floor document into the floors collection, ensuring </w:t>
-      </w:r>
-      <w:proofErr w:type="spellStart"/>
-      <w:r>
-        <w:t>garage_id</w:t>
-      </w:r>
-      <w:proofErr w:type="spellEnd"/>
-      <w:r>
-        <w:t> is set appropriately.</w:t>
+        <w:t>Insert a new floor document into the floors collection, ensuring garage_id is set appropriately.</w:t>
       </w:r>
     </w:p>
     <w:p>
@@ -9676,13 +8056,8 @@
               <w:cnfStyle w:val="100000000000" w:firstRow="1" w:lastRow="0" w:firstColumn="0" w:lastColumn="0" w:oddVBand="0" w:evenVBand="0" w:oddHBand="0" w:evenHBand="0" w:firstRowFirstColumn="0" w:firstRowLastColumn="0" w:lastRowFirstColumn="0" w:lastRowLastColumn="0"/>
             </w:pPr>
             <w:r>
-              <w:t>Frontend/</w:t>
+              <w:t>Frontend/Ux</w:t>
             </w:r>
-            <w:proofErr w:type="spellStart"/>
-            <w:r>
-              <w:t>Ux</w:t>
-            </w:r>
-            <w:proofErr w:type="spellEnd"/>
           </w:p>
         </w:tc>
       </w:tr>
@@ -9716,15 +8091,7 @@
               <w:cnfStyle w:val="000000100000" w:firstRow="0" w:lastRow="0" w:firstColumn="0" w:lastColumn="0" w:oddVBand="0" w:evenVBand="0" w:oddHBand="1" w:evenHBand="0" w:firstRowFirstColumn="0" w:firstRowLastColumn="0" w:lastRowFirstColumn="0" w:lastRowLastColumn="0"/>
             </w:pPr>
             <w:r>
-              <w:t>Add </w:t>
-            </w:r>
-            <w:proofErr w:type="spellStart"/>
-            <w:r>
-              <w:t>garage_id</w:t>
-            </w:r>
-            <w:proofErr w:type="spellEnd"/>
-            <w:r>
-              <w:t>; new garages</w:t>
+              <w:t>Add garage_id; new garages</w:t>
             </w:r>
           </w:p>
         </w:tc>
@@ -9739,15 +8106,7 @@
               <w:cnfStyle w:val="000000100000" w:firstRow="0" w:lastRow="0" w:firstColumn="0" w:lastColumn="0" w:oddVBand="0" w:evenVBand="0" w:oddHBand="1" w:evenHBand="0" w:firstRowFirstColumn="0" w:firstRowLastColumn="0" w:lastRowFirstColumn="0" w:lastRowLastColumn="0"/>
             </w:pPr>
             <w:r>
-              <w:t>Filter all queries by </w:t>
-            </w:r>
-            <w:proofErr w:type="spellStart"/>
-            <w:r>
-              <w:t>garage_id</w:t>
-            </w:r>
-            <w:proofErr w:type="spellEnd"/>
-            <w:r>
-              <w:t>;</w:t>
+              <w:t>Filter all queries by garage_id;</w:t>
             </w:r>
           </w:p>
         </w:tc>
@@ -9795,13 +8154,8 @@
               <w:cnfStyle w:val="000000000000" w:firstRow="0" w:lastRow="0" w:firstColumn="0" w:lastColumn="0" w:oddVBand="0" w:evenVBand="0" w:oddHBand="0" w:evenHBand="0" w:firstRowFirstColumn="0" w:firstRowLastColumn="0" w:lastRowFirstColumn="0" w:lastRowLastColumn="0"/>
             </w:pPr>
             <w:r>
-              <w:t>Add new floor docs with </w:t>
+              <w:t>Add new floor docs with garage_id</w:t>
             </w:r>
-            <w:proofErr w:type="spellStart"/>
-            <w:r>
-              <w:t>garage_id</w:t>
-            </w:r>
-            <w:proofErr w:type="spellEnd"/>
           </w:p>
         </w:tc>
         <w:tc>
@@ -9860,20 +8214,8 @@
           <w:szCs w:val="28"/>
           <w:highlight w:val="yellow"/>
         </w:rPr>
-        <w:t xml:space="preserve">Extend to add Reports, Alerts, Analytics </w:t>
-      </w:r>
-      <w:proofErr w:type="spellStart"/>
-      <w:r>
-        <w:rPr>
-          <w:b/>
-          <w:bCs/>
-          <w:sz w:val="28"/>
-          <w:szCs w:val="28"/>
-          <w:highlight w:val="yellow"/>
-        </w:rPr>
-        <w:t>etc</w:t>
-      </w:r>
-      <w:proofErr w:type="spellEnd"/>
+        <w:t>Extend to add Reports, Alerts, Analytics etc</w:t>
+      </w:r>
     </w:p>
     <w:p>
       <w:pPr>
@@ -15046,6 +13388,7 @@
   <w:style w:type="character" w:default="1" w:styleId="DefaultParagraphFont">
     <w:name w:val="Default Paragraph Font"/>
     <w:uiPriority w:val="1"/>
+    <w:semiHidden/>
     <w:unhideWhenUsed/>
   </w:style>
   <w:style w:type="table" w:default="1" w:styleId="TableNormal">

</xml_diff>